<commit_message>
Add password hashing service, relay command implementation, and main view model
- Implemented PasswordHasher service for secure password storage and verification.
- Added RelayCommand class to facilitate command binding in the UI.
- Created MainViewModel to manage application state, user authentication, and CRUD operations for users, groups, subjects, and schedules.
- Introduced styles in XAML for consistent UI design across various controls.
- Updated project file to include Microsoft.Data.Sqlite package for database interactions.
</commit_message>
<xml_diff>
--- a/cat.docx
+++ b/cat.docx
@@ -683,6 +683,7 @@
           <w:lang w:val="en-150" w:eastAsia="en-150"/>
         </w:rPr>
       </w:pPr>
+      <w:proofErr w:type="spellStart"/>
       <w:r>
         <w:rPr>
           <w:color w:val="000000"/>
@@ -690,8 +691,89 @@
           <w:szCs w:val="24"/>
           <w:lang w:val="en-150" w:eastAsia="en-150"/>
         </w:rPr>
-        <w:t>Зам. директора по учебной работе</w:t>
-      </w:r>
+        <w:t>Зам</w:t>
+      </w:r>
+      <w:proofErr w:type="spellEnd"/>
+      <w:r>
+        <w:rPr>
+          <w:color w:val="000000"/>
+          <w:sz w:val="24"/>
+          <w:szCs w:val="24"/>
+          <w:lang w:val="en-150" w:eastAsia="en-150"/>
+        </w:rPr>
+        <w:t xml:space="preserve">. </w:t>
+      </w:r>
+      <w:proofErr w:type="spellStart"/>
+      <w:r>
+        <w:rPr>
+          <w:color w:val="000000"/>
+          <w:sz w:val="24"/>
+          <w:szCs w:val="24"/>
+          <w:lang w:val="en-150" w:eastAsia="en-150"/>
+        </w:rPr>
+        <w:t>директора</w:t>
+      </w:r>
+      <w:proofErr w:type="spellEnd"/>
+      <w:r>
+        <w:rPr>
+          <w:color w:val="000000"/>
+          <w:sz w:val="24"/>
+          <w:szCs w:val="24"/>
+          <w:lang w:val="en-150" w:eastAsia="en-150"/>
+        </w:rPr>
+        <w:t xml:space="preserve"> </w:t>
+      </w:r>
+      <w:proofErr w:type="spellStart"/>
+      <w:r>
+        <w:rPr>
+          <w:color w:val="000000"/>
+          <w:sz w:val="24"/>
+          <w:szCs w:val="24"/>
+          <w:lang w:val="en-150" w:eastAsia="en-150"/>
+        </w:rPr>
+        <w:t>по</w:t>
+      </w:r>
+      <w:proofErr w:type="spellEnd"/>
+      <w:r>
+        <w:rPr>
+          <w:color w:val="000000"/>
+          <w:sz w:val="24"/>
+          <w:szCs w:val="24"/>
+          <w:lang w:val="en-150" w:eastAsia="en-150"/>
+        </w:rPr>
+        <w:t xml:space="preserve"> </w:t>
+      </w:r>
+      <w:proofErr w:type="spellStart"/>
+      <w:r>
+        <w:rPr>
+          <w:color w:val="000000"/>
+          <w:sz w:val="24"/>
+          <w:szCs w:val="24"/>
+          <w:lang w:val="en-150" w:eastAsia="en-150"/>
+        </w:rPr>
+        <w:t>учебной</w:t>
+      </w:r>
+      <w:proofErr w:type="spellEnd"/>
+      <w:r>
+        <w:rPr>
+          <w:color w:val="000000"/>
+          <w:sz w:val="24"/>
+          <w:szCs w:val="24"/>
+          <w:lang w:val="en-150" w:eastAsia="en-150"/>
+        </w:rPr>
+        <w:t xml:space="preserve"> </w:t>
+      </w:r>
+      <w:proofErr w:type="spellStart"/>
+      <w:r>
+        <w:rPr>
+          <w:color w:val="000000"/>
+          <w:sz w:val="24"/>
+          <w:szCs w:val="24"/>
+          <w:lang w:val="en-150" w:eastAsia="en-150"/>
+        </w:rPr>
+        <w:t>работе</w:t>
+      </w:r>
+      <w:proofErr w:type="spellEnd"/>
     </w:p>
     <w:p>
       <w:pPr>
@@ -712,7 +794,27 @@
           <w:szCs w:val="24"/>
           <w:lang w:val="en-150" w:eastAsia="en-150"/>
         </w:rPr>
-        <w:t>__________________ / Вишневская М.В/</w:t>
+        <w:t xml:space="preserve">__________________ / </w:t>
+      </w:r>
+      <w:proofErr w:type="spellStart"/>
+      <w:r>
+        <w:rPr>
+          <w:color w:val="000000"/>
+          <w:sz w:val="24"/>
+          <w:szCs w:val="24"/>
+          <w:lang w:val="en-150" w:eastAsia="en-150"/>
+        </w:rPr>
+        <w:t>Вишневская</w:t>
+      </w:r>
+      <w:proofErr w:type="spellEnd"/>
+      <w:r>
+        <w:rPr>
+          <w:color w:val="000000"/>
+          <w:sz w:val="24"/>
+          <w:szCs w:val="24"/>
+          <w:lang w:val="en-150" w:eastAsia="en-150"/>
+        </w:rPr>
+        <w:t xml:space="preserve"> М.В/</w:t>
       </w:r>
     </w:p>
     <w:p>
@@ -786,6 +888,7 @@
           <w:lang w:val="en-150" w:eastAsia="en-150"/>
         </w:rPr>
       </w:pPr>
+      <w:proofErr w:type="spellStart"/>
       <w:r>
         <w:rPr>
           <w:b/>
@@ -795,8 +898,81 @@
           <w:szCs w:val="24"/>
           <w:lang w:val="en-150" w:eastAsia="en-150"/>
         </w:rPr>
-        <w:t>на выполнение курсового проекта</w:t>
-      </w:r>
+        <w:t>на</w:t>
+      </w:r>
+      <w:proofErr w:type="spellEnd"/>
+      <w:r>
+        <w:rPr>
+          <w:b/>
+          <w:bCs/>
+          <w:color w:val="000000"/>
+          <w:sz w:val="24"/>
+          <w:szCs w:val="24"/>
+          <w:lang w:val="en-150" w:eastAsia="en-150"/>
+        </w:rPr>
+        <w:t xml:space="preserve"> </w:t>
+      </w:r>
+      <w:proofErr w:type="spellStart"/>
+      <w:r>
+        <w:rPr>
+          <w:b/>
+          <w:bCs/>
+          <w:color w:val="000000"/>
+          <w:sz w:val="24"/>
+          <w:szCs w:val="24"/>
+          <w:lang w:val="en-150" w:eastAsia="en-150"/>
+        </w:rPr>
+        <w:t>выполнение</w:t>
+      </w:r>
+      <w:proofErr w:type="spellEnd"/>
+      <w:r>
+        <w:rPr>
+          <w:b/>
+          <w:bCs/>
+          <w:color w:val="000000"/>
+          <w:sz w:val="24"/>
+          <w:szCs w:val="24"/>
+          <w:lang w:val="en-150" w:eastAsia="en-150"/>
+        </w:rPr>
+        <w:t xml:space="preserve"> </w:t>
+      </w:r>
+      <w:proofErr w:type="spellStart"/>
+      <w:r>
+        <w:rPr>
+          <w:b/>
+          <w:bCs/>
+          <w:color w:val="000000"/>
+          <w:sz w:val="24"/>
+          <w:szCs w:val="24"/>
+          <w:lang w:val="en-150" w:eastAsia="en-150"/>
+        </w:rPr>
+        <w:t>курсового</w:t>
+      </w:r>
+      <w:proofErr w:type="spellEnd"/>
+      <w:r>
+        <w:rPr>
+          <w:b/>
+          <w:bCs/>
+          <w:color w:val="000000"/>
+          <w:sz w:val="24"/>
+          <w:szCs w:val="24"/>
+          <w:lang w:val="en-150" w:eastAsia="en-150"/>
+        </w:rPr>
+        <w:t xml:space="preserve"> </w:t>
+      </w:r>
+      <w:proofErr w:type="spellStart"/>
+      <w:r>
+        <w:rPr>
+          <w:b/>
+          <w:bCs/>
+          <w:color w:val="000000"/>
+          <w:sz w:val="24"/>
+          <w:szCs w:val="24"/>
+          <w:lang w:val="en-150" w:eastAsia="en-150"/>
+        </w:rPr>
+        <w:t>проекта</w:t>
+      </w:r>
+      <w:proofErr w:type="spellEnd"/>
     </w:p>
     <w:p>
       <w:pPr>
@@ -830,8 +1006,19 @@
           <w:szCs w:val="22"/>
           <w:lang w:val="en-150" w:eastAsia="en-150"/>
         </w:rPr>
-        <w:t>1. Студент</w:t>
-      </w:r>
+        <w:t xml:space="preserve">1. </w:t>
+      </w:r>
+      <w:proofErr w:type="spellStart"/>
+      <w:r>
+        <w:rPr>
+          <w:color w:val="000000"/>
+          <w:sz w:val="22"/>
+          <w:szCs w:val="22"/>
+          <w:lang w:val="en-150" w:eastAsia="en-150"/>
+        </w:rPr>
+        <w:t>Студент</w:t>
+      </w:r>
+      <w:proofErr w:type="spellEnd"/>
       <w:r>
         <w:rPr>
           <w:b/>
@@ -841,8 +1028,69 @@
           <w:szCs w:val="22"/>
           <w:lang w:val="en-150" w:eastAsia="en-150"/>
         </w:rPr>
-        <w:t xml:space="preserve"> Кот Андрей Ильич</w:t>
-      </w:r>
+        <w:t xml:space="preserve"> </w:t>
+      </w:r>
+      <w:proofErr w:type="spellStart"/>
+      <w:r>
+        <w:rPr>
+          <w:b/>
+          <w:bCs/>
+          <w:color w:val="000000"/>
+          <w:sz w:val="22"/>
+          <w:szCs w:val="22"/>
+          <w:lang w:val="en-150" w:eastAsia="en-150"/>
+        </w:rPr>
+        <w:t>Кот</w:t>
+      </w:r>
+      <w:proofErr w:type="spellEnd"/>
+      <w:r>
+        <w:rPr>
+          <w:b/>
+          <w:bCs/>
+          <w:color w:val="000000"/>
+          <w:sz w:val="22"/>
+          <w:szCs w:val="22"/>
+          <w:lang w:val="en-150" w:eastAsia="en-150"/>
+        </w:rPr>
+        <w:t xml:space="preserve"> </w:t>
+      </w:r>
+      <w:proofErr w:type="spellStart"/>
+      <w:r>
+        <w:rPr>
+          <w:b/>
+          <w:bCs/>
+          <w:color w:val="000000"/>
+          <w:sz w:val="22"/>
+          <w:szCs w:val="22"/>
+          <w:lang w:val="en-150" w:eastAsia="en-150"/>
+        </w:rPr>
+        <w:t>Андрей</w:t>
+      </w:r>
+      <w:proofErr w:type="spellEnd"/>
+      <w:r>
+        <w:rPr>
+          <w:b/>
+          <w:bCs/>
+          <w:color w:val="000000"/>
+          <w:sz w:val="22"/>
+          <w:szCs w:val="22"/>
+          <w:lang w:val="en-150" w:eastAsia="en-150"/>
+        </w:rPr>
+        <w:t xml:space="preserve"> </w:t>
+      </w:r>
+      <w:proofErr w:type="spellStart"/>
+      <w:r>
+        <w:rPr>
+          <w:b/>
+          <w:bCs/>
+          <w:color w:val="000000"/>
+          <w:sz w:val="22"/>
+          <w:szCs w:val="22"/>
+          <w:lang w:val="en-150" w:eastAsia="en-150"/>
+        </w:rPr>
+        <w:t>Ильич</w:t>
+      </w:r>
+      <w:proofErr w:type="spellEnd"/>
     </w:p>
     <w:p>
       <w:pPr>
@@ -856,14 +1104,25 @@
           <w:lang w:val="en-150" w:eastAsia="en-150"/>
         </w:rPr>
       </w:pPr>
-      <w:r>
-        <w:rPr>
-          <w:color w:val="000000"/>
-          <w:sz w:val="22"/>
-          <w:szCs w:val="22"/>
-          <w:lang w:val="en-150" w:eastAsia="en-150"/>
-        </w:rPr>
-        <w:t xml:space="preserve">Группа </w:t>
+      <w:proofErr w:type="spellStart"/>
+      <w:r>
+        <w:rPr>
+          <w:color w:val="000000"/>
+          <w:sz w:val="22"/>
+          <w:szCs w:val="22"/>
+          <w:lang w:val="en-150" w:eastAsia="en-150"/>
+        </w:rPr>
+        <w:t>Группа</w:t>
+      </w:r>
+      <w:proofErr w:type="spellEnd"/>
+      <w:r>
+        <w:rPr>
+          <w:color w:val="000000"/>
+          <w:sz w:val="22"/>
+          <w:szCs w:val="22"/>
+          <w:lang w:val="en-150" w:eastAsia="en-150"/>
+        </w:rPr>
+        <w:t xml:space="preserve"> </w:t>
       </w:r>
       <w:r>
         <w:rPr>
@@ -888,14 +1147,125 @@
           <w:lang w:val="en-150" w:eastAsia="en-150"/>
         </w:rPr>
       </w:pPr>
-      <w:r>
-        <w:rPr>
-          <w:color w:val="000000"/>
-          <w:sz w:val="22"/>
-          <w:szCs w:val="22"/>
-          <w:lang w:val="en-150" w:eastAsia="en-150"/>
-        </w:rPr>
-        <w:t>Специальность: 09.02.07 Информационные системы и программирование (базовый уровень)</w:t>
+      <w:proofErr w:type="spellStart"/>
+      <w:r>
+        <w:rPr>
+          <w:color w:val="000000"/>
+          <w:sz w:val="22"/>
+          <w:szCs w:val="22"/>
+          <w:lang w:val="en-150" w:eastAsia="en-150"/>
+        </w:rPr>
+        <w:t>Специальность</w:t>
+      </w:r>
+      <w:proofErr w:type="spellEnd"/>
+      <w:r>
+        <w:rPr>
+          <w:color w:val="000000"/>
+          <w:sz w:val="22"/>
+          <w:szCs w:val="22"/>
+          <w:lang w:val="en-150" w:eastAsia="en-150"/>
+        </w:rPr>
+        <w:t xml:space="preserve">: 09.02.07 </w:t>
+      </w:r>
+      <w:proofErr w:type="spellStart"/>
+      <w:r>
+        <w:rPr>
+          <w:color w:val="000000"/>
+          <w:sz w:val="22"/>
+          <w:szCs w:val="22"/>
+          <w:lang w:val="en-150" w:eastAsia="en-150"/>
+        </w:rPr>
+        <w:t>Информационные</w:t>
+      </w:r>
+      <w:proofErr w:type="spellEnd"/>
+      <w:r>
+        <w:rPr>
+          <w:color w:val="000000"/>
+          <w:sz w:val="22"/>
+          <w:szCs w:val="22"/>
+          <w:lang w:val="en-150" w:eastAsia="en-150"/>
+        </w:rPr>
+        <w:t xml:space="preserve"> </w:t>
+      </w:r>
+      <w:proofErr w:type="spellStart"/>
+      <w:r>
+        <w:rPr>
+          <w:color w:val="000000"/>
+          <w:sz w:val="22"/>
+          <w:szCs w:val="22"/>
+          <w:lang w:val="en-150" w:eastAsia="en-150"/>
+        </w:rPr>
+        <w:t>системы</w:t>
+      </w:r>
+      <w:proofErr w:type="spellEnd"/>
+      <w:r>
+        <w:rPr>
+          <w:color w:val="000000"/>
+          <w:sz w:val="22"/>
+          <w:szCs w:val="22"/>
+          <w:lang w:val="en-150" w:eastAsia="en-150"/>
+        </w:rPr>
+        <w:t xml:space="preserve"> и </w:t>
+      </w:r>
+      <w:proofErr w:type="spellStart"/>
+      <w:r>
+        <w:rPr>
+          <w:color w:val="000000"/>
+          <w:sz w:val="22"/>
+          <w:szCs w:val="22"/>
+          <w:lang w:val="en-150" w:eastAsia="en-150"/>
+        </w:rPr>
+        <w:t>программирование</w:t>
+      </w:r>
+      <w:proofErr w:type="spellEnd"/>
+      <w:r>
+        <w:rPr>
+          <w:color w:val="000000"/>
+          <w:sz w:val="22"/>
+          <w:szCs w:val="22"/>
+          <w:lang w:val="en-150" w:eastAsia="en-150"/>
+        </w:rPr>
+        <w:t xml:space="preserve"> (</w:t>
+      </w:r>
+      <w:proofErr w:type="spellStart"/>
+      <w:r>
+        <w:rPr>
+          <w:color w:val="000000"/>
+          <w:sz w:val="22"/>
+          <w:szCs w:val="22"/>
+          <w:lang w:val="en-150" w:eastAsia="en-150"/>
+        </w:rPr>
+        <w:t>базовый</w:t>
+      </w:r>
+      <w:proofErr w:type="spellEnd"/>
+      <w:r>
+        <w:rPr>
+          <w:color w:val="000000"/>
+          <w:sz w:val="22"/>
+          <w:szCs w:val="22"/>
+          <w:lang w:val="en-150" w:eastAsia="en-150"/>
+        </w:rPr>
+        <w:t xml:space="preserve"> </w:t>
+      </w:r>
+      <w:proofErr w:type="spellStart"/>
+      <w:r>
+        <w:rPr>
+          <w:color w:val="000000"/>
+          <w:sz w:val="22"/>
+          <w:szCs w:val="22"/>
+          <w:lang w:val="en-150" w:eastAsia="en-150"/>
+        </w:rPr>
+        <w:t>уровень</w:t>
+      </w:r>
+      <w:proofErr w:type="spellEnd"/>
+      <w:r>
+        <w:rPr>
+          <w:color w:val="000000"/>
+          <w:sz w:val="22"/>
+          <w:szCs w:val="22"/>
+          <w:lang w:val="en-150" w:eastAsia="en-150"/>
+        </w:rPr>
+        <w:t>)</w:t>
       </w:r>
     </w:p>
     <w:p>
@@ -909,14 +1279,145 @@
           <w:lang w:val="en-150" w:eastAsia="en-150"/>
         </w:rPr>
       </w:pPr>
-      <w:r>
-        <w:rPr>
-          <w:color w:val="000000"/>
-          <w:sz w:val="22"/>
-          <w:szCs w:val="22"/>
-          <w:lang w:val="en-150" w:eastAsia="en-150"/>
-        </w:rPr>
-        <w:t>Дисциплина/Междисциплинарный курс: МДК 07.01 «Управление и автоматизация баз данных»</w:t>
+      <w:proofErr w:type="spellStart"/>
+      <w:r>
+        <w:rPr>
+          <w:color w:val="000000"/>
+          <w:sz w:val="22"/>
+          <w:szCs w:val="22"/>
+          <w:lang w:val="en-150" w:eastAsia="en-150"/>
+        </w:rPr>
+        <w:t>Дисциплина</w:t>
+      </w:r>
+      <w:proofErr w:type="spellEnd"/>
+      <w:r>
+        <w:rPr>
+          <w:color w:val="000000"/>
+          <w:sz w:val="22"/>
+          <w:szCs w:val="22"/>
+          <w:lang w:val="en-150" w:eastAsia="en-150"/>
+        </w:rPr>
+        <w:t>/</w:t>
+      </w:r>
+      <w:proofErr w:type="spellStart"/>
+      <w:r>
+        <w:rPr>
+          <w:color w:val="000000"/>
+          <w:sz w:val="22"/>
+          <w:szCs w:val="22"/>
+          <w:lang w:val="en-150" w:eastAsia="en-150"/>
+        </w:rPr>
+        <w:t>Междисциплинарный</w:t>
+      </w:r>
+      <w:proofErr w:type="spellEnd"/>
+      <w:r>
+        <w:rPr>
+          <w:color w:val="000000"/>
+          <w:sz w:val="22"/>
+          <w:szCs w:val="22"/>
+          <w:lang w:val="en-150" w:eastAsia="en-150"/>
+        </w:rPr>
+        <w:t xml:space="preserve"> </w:t>
+      </w:r>
+      <w:proofErr w:type="spellStart"/>
+      <w:r>
+        <w:rPr>
+          <w:color w:val="000000"/>
+          <w:sz w:val="22"/>
+          <w:szCs w:val="22"/>
+          <w:lang w:val="en-150" w:eastAsia="en-150"/>
+        </w:rPr>
+        <w:t>курс</w:t>
+      </w:r>
+      <w:proofErr w:type="spellEnd"/>
+      <w:r>
+        <w:rPr>
+          <w:color w:val="000000"/>
+          <w:sz w:val="22"/>
+          <w:szCs w:val="22"/>
+          <w:lang w:val="en-150" w:eastAsia="en-150"/>
+        </w:rPr>
+        <w:t>: МДК 07.01 «</w:t>
+      </w:r>
+      <w:proofErr w:type="spellStart"/>
+      <w:r>
+        <w:rPr>
+          <w:color w:val="000000"/>
+          <w:sz w:val="22"/>
+          <w:szCs w:val="22"/>
+          <w:lang w:val="en-150" w:eastAsia="en-150"/>
+        </w:rPr>
+        <w:t>Управление</w:t>
+      </w:r>
+      <w:proofErr w:type="spellEnd"/>
+      <w:r>
+        <w:rPr>
+          <w:color w:val="000000"/>
+          <w:sz w:val="22"/>
+          <w:szCs w:val="22"/>
+          <w:lang w:val="en-150" w:eastAsia="en-150"/>
+        </w:rPr>
+        <w:t xml:space="preserve"> и </w:t>
+      </w:r>
+      <w:proofErr w:type="spellStart"/>
+      <w:r>
+        <w:rPr>
+          <w:color w:val="000000"/>
+          <w:sz w:val="22"/>
+          <w:szCs w:val="22"/>
+          <w:lang w:val="en-150" w:eastAsia="en-150"/>
+        </w:rPr>
+        <w:t>автоматизация</w:t>
+      </w:r>
+      <w:proofErr w:type="spellEnd"/>
+      <w:r>
+        <w:rPr>
+          <w:color w:val="000000"/>
+          <w:sz w:val="22"/>
+          <w:szCs w:val="22"/>
+          <w:lang w:val="en-150" w:eastAsia="en-150"/>
+        </w:rPr>
+        <w:t xml:space="preserve"> </w:t>
+      </w:r>
+      <w:proofErr w:type="spellStart"/>
+      <w:r>
+        <w:rPr>
+          <w:color w:val="000000"/>
+          <w:sz w:val="22"/>
+          <w:szCs w:val="22"/>
+          <w:lang w:val="en-150" w:eastAsia="en-150"/>
+        </w:rPr>
+        <w:t>баз</w:t>
+      </w:r>
+      <w:proofErr w:type="spellEnd"/>
+      <w:r>
+        <w:rPr>
+          <w:color w:val="000000"/>
+          <w:sz w:val="22"/>
+          <w:szCs w:val="22"/>
+          <w:lang w:val="en-150" w:eastAsia="en-150"/>
+        </w:rPr>
+        <w:t xml:space="preserve"> </w:t>
+      </w:r>
+      <w:proofErr w:type="spellStart"/>
+      <w:r>
+        <w:rPr>
+          <w:color w:val="000000"/>
+          <w:sz w:val="22"/>
+          <w:szCs w:val="22"/>
+          <w:lang w:val="en-150" w:eastAsia="en-150"/>
+        </w:rPr>
+        <w:t>данных</w:t>
+      </w:r>
+      <w:proofErr w:type="spellEnd"/>
+      <w:r>
+        <w:rPr>
+          <w:color w:val="000000"/>
+          <w:sz w:val="22"/>
+          <w:szCs w:val="22"/>
+          <w:lang w:val="en-150" w:eastAsia="en-150"/>
+        </w:rPr>
+        <w:t>»</w:t>
       </w:r>
     </w:p>
     <w:p>
@@ -937,7 +1438,87 @@
           <w:szCs w:val="22"/>
           <w:lang w:val="en-150" w:eastAsia="en-150"/>
         </w:rPr>
-        <w:t xml:space="preserve">2. Курсовой проект на тему </w:t>
+        <w:t xml:space="preserve">2. </w:t>
+      </w:r>
+      <w:proofErr w:type="spellStart"/>
+      <w:r>
+        <w:rPr>
+          <w:color w:val="000000"/>
+          <w:sz w:val="22"/>
+          <w:szCs w:val="22"/>
+          <w:lang w:val="en-150" w:eastAsia="en-150"/>
+        </w:rPr>
+        <w:t>Курсовой</w:t>
+      </w:r>
+      <w:proofErr w:type="spellEnd"/>
+      <w:r>
+        <w:rPr>
+          <w:color w:val="000000"/>
+          <w:sz w:val="22"/>
+          <w:szCs w:val="22"/>
+          <w:lang w:val="en-150" w:eastAsia="en-150"/>
+        </w:rPr>
+        <w:t xml:space="preserve"> </w:t>
+      </w:r>
+      <w:proofErr w:type="spellStart"/>
+      <w:r>
+        <w:rPr>
+          <w:color w:val="000000"/>
+          <w:sz w:val="22"/>
+          <w:szCs w:val="22"/>
+          <w:lang w:val="en-150" w:eastAsia="en-150"/>
+        </w:rPr>
+        <w:t>проект</w:t>
+      </w:r>
+      <w:proofErr w:type="spellEnd"/>
+      <w:r>
+        <w:rPr>
+          <w:color w:val="000000"/>
+          <w:sz w:val="22"/>
+          <w:szCs w:val="22"/>
+          <w:lang w:val="en-150" w:eastAsia="en-150"/>
+        </w:rPr>
+        <w:t xml:space="preserve"> </w:t>
+      </w:r>
+      <w:proofErr w:type="spellStart"/>
+      <w:r>
+        <w:rPr>
+          <w:color w:val="000000"/>
+          <w:sz w:val="22"/>
+          <w:szCs w:val="22"/>
+          <w:lang w:val="en-150" w:eastAsia="en-150"/>
+        </w:rPr>
+        <w:t>на</w:t>
+      </w:r>
+      <w:proofErr w:type="spellEnd"/>
+      <w:r>
+        <w:rPr>
+          <w:color w:val="000000"/>
+          <w:sz w:val="22"/>
+          <w:szCs w:val="22"/>
+          <w:lang w:val="en-150" w:eastAsia="en-150"/>
+        </w:rPr>
+        <w:t xml:space="preserve"> </w:t>
+      </w:r>
+      <w:proofErr w:type="spellStart"/>
+      <w:r>
+        <w:rPr>
+          <w:color w:val="000000"/>
+          <w:sz w:val="22"/>
+          <w:szCs w:val="22"/>
+          <w:lang w:val="en-150" w:eastAsia="en-150"/>
+        </w:rPr>
+        <w:t>тему</w:t>
+      </w:r>
+      <w:proofErr w:type="spellEnd"/>
+      <w:r>
+        <w:rPr>
+          <w:color w:val="000000"/>
+          <w:sz w:val="22"/>
+          <w:szCs w:val="22"/>
+          <w:lang w:val="en-150" w:eastAsia="en-150"/>
+        </w:rPr>
+        <w:t xml:space="preserve"> </w:t>
       </w:r>
       <w:r>
         <w:rPr>
@@ -948,7 +1529,367 @@
           <w:szCs w:val="22"/>
           <w:lang w:val="en-150" w:eastAsia="en-150"/>
         </w:rPr>
-        <w:t>«Проектирование базы данных и разработка серверного REST API для автоматизации учебной платформы колледжа с ролями Администратор/Студент и QR-учётом посещаемости»</w:t>
+        <w:t>«</w:t>
+      </w:r>
+      <w:proofErr w:type="spellStart"/>
+      <w:r>
+        <w:rPr>
+          <w:b/>
+          <w:bCs/>
+          <w:color w:val="000000"/>
+          <w:sz w:val="22"/>
+          <w:szCs w:val="22"/>
+          <w:lang w:val="en-150" w:eastAsia="en-150"/>
+        </w:rPr>
+        <w:t>Проектирование</w:t>
+      </w:r>
+      <w:proofErr w:type="spellEnd"/>
+      <w:r>
+        <w:rPr>
+          <w:b/>
+          <w:bCs/>
+          <w:color w:val="000000"/>
+          <w:sz w:val="22"/>
+          <w:szCs w:val="22"/>
+          <w:lang w:val="en-150" w:eastAsia="en-150"/>
+        </w:rPr>
+        <w:t xml:space="preserve"> </w:t>
+      </w:r>
+      <w:proofErr w:type="spellStart"/>
+      <w:r>
+        <w:rPr>
+          <w:b/>
+          <w:bCs/>
+          <w:color w:val="000000"/>
+          <w:sz w:val="22"/>
+          <w:szCs w:val="22"/>
+          <w:lang w:val="en-150" w:eastAsia="en-150"/>
+        </w:rPr>
+        <w:t>базы</w:t>
+      </w:r>
+      <w:proofErr w:type="spellEnd"/>
+      <w:r>
+        <w:rPr>
+          <w:b/>
+          <w:bCs/>
+          <w:color w:val="000000"/>
+          <w:sz w:val="22"/>
+          <w:szCs w:val="22"/>
+          <w:lang w:val="en-150" w:eastAsia="en-150"/>
+        </w:rPr>
+        <w:t xml:space="preserve"> </w:t>
+      </w:r>
+      <w:proofErr w:type="spellStart"/>
+      <w:r>
+        <w:rPr>
+          <w:b/>
+          <w:bCs/>
+          <w:color w:val="000000"/>
+          <w:sz w:val="22"/>
+          <w:szCs w:val="22"/>
+          <w:lang w:val="en-150" w:eastAsia="en-150"/>
+        </w:rPr>
+        <w:t>данных</w:t>
+      </w:r>
+      <w:proofErr w:type="spellEnd"/>
+      <w:r>
+        <w:rPr>
+          <w:b/>
+          <w:bCs/>
+          <w:color w:val="000000"/>
+          <w:sz w:val="22"/>
+          <w:szCs w:val="22"/>
+          <w:lang w:val="en-150" w:eastAsia="en-150"/>
+        </w:rPr>
+        <w:t xml:space="preserve"> и </w:t>
+      </w:r>
+      <w:proofErr w:type="spellStart"/>
+      <w:r>
+        <w:rPr>
+          <w:b/>
+          <w:bCs/>
+          <w:color w:val="000000"/>
+          <w:sz w:val="22"/>
+          <w:szCs w:val="22"/>
+          <w:lang w:val="en-150" w:eastAsia="en-150"/>
+        </w:rPr>
+        <w:t>разработка</w:t>
+      </w:r>
+      <w:proofErr w:type="spellEnd"/>
+      <w:r>
+        <w:rPr>
+          <w:b/>
+          <w:bCs/>
+          <w:color w:val="000000"/>
+          <w:sz w:val="22"/>
+          <w:szCs w:val="22"/>
+          <w:lang w:val="en-150" w:eastAsia="en-150"/>
+        </w:rPr>
+        <w:t xml:space="preserve"> </w:t>
+      </w:r>
+      <w:proofErr w:type="spellStart"/>
+      <w:r>
+        <w:rPr>
+          <w:b/>
+          <w:bCs/>
+          <w:color w:val="000000"/>
+          <w:sz w:val="22"/>
+          <w:szCs w:val="22"/>
+          <w:lang w:val="en-150" w:eastAsia="en-150"/>
+        </w:rPr>
+        <w:t>серверного</w:t>
+      </w:r>
+      <w:proofErr w:type="spellEnd"/>
+      <w:r>
+        <w:rPr>
+          <w:b/>
+          <w:bCs/>
+          <w:color w:val="000000"/>
+          <w:sz w:val="22"/>
+          <w:szCs w:val="22"/>
+          <w:lang w:val="en-150" w:eastAsia="en-150"/>
+        </w:rPr>
+        <w:t xml:space="preserve"> REST API </w:t>
+      </w:r>
+      <w:proofErr w:type="spellStart"/>
+      <w:r>
+        <w:rPr>
+          <w:b/>
+          <w:bCs/>
+          <w:color w:val="000000"/>
+          <w:sz w:val="22"/>
+          <w:szCs w:val="22"/>
+          <w:lang w:val="en-150" w:eastAsia="en-150"/>
+        </w:rPr>
+        <w:t>для</w:t>
+      </w:r>
+      <w:proofErr w:type="spellEnd"/>
+      <w:r>
+        <w:rPr>
+          <w:b/>
+          <w:bCs/>
+          <w:color w:val="000000"/>
+          <w:sz w:val="22"/>
+          <w:szCs w:val="22"/>
+          <w:lang w:val="en-150" w:eastAsia="en-150"/>
+        </w:rPr>
+        <w:t xml:space="preserve"> </w:t>
+      </w:r>
+      <w:proofErr w:type="spellStart"/>
+      <w:r>
+        <w:rPr>
+          <w:b/>
+          <w:bCs/>
+          <w:color w:val="000000"/>
+          <w:sz w:val="22"/>
+          <w:szCs w:val="22"/>
+          <w:lang w:val="en-150" w:eastAsia="en-150"/>
+        </w:rPr>
+        <w:t>автоматизации</w:t>
+      </w:r>
+      <w:proofErr w:type="spellEnd"/>
+      <w:r>
+        <w:rPr>
+          <w:b/>
+          <w:bCs/>
+          <w:color w:val="000000"/>
+          <w:sz w:val="22"/>
+          <w:szCs w:val="22"/>
+          <w:lang w:val="en-150" w:eastAsia="en-150"/>
+        </w:rPr>
+        <w:t xml:space="preserve"> </w:t>
+      </w:r>
+      <w:proofErr w:type="spellStart"/>
+      <w:r>
+        <w:rPr>
+          <w:b/>
+          <w:bCs/>
+          <w:color w:val="000000"/>
+          <w:sz w:val="22"/>
+          <w:szCs w:val="22"/>
+          <w:lang w:val="en-150" w:eastAsia="en-150"/>
+        </w:rPr>
+        <w:t>учебной</w:t>
+      </w:r>
+      <w:proofErr w:type="spellEnd"/>
+      <w:r>
+        <w:rPr>
+          <w:b/>
+          <w:bCs/>
+          <w:color w:val="000000"/>
+          <w:sz w:val="22"/>
+          <w:szCs w:val="22"/>
+          <w:lang w:val="en-150" w:eastAsia="en-150"/>
+        </w:rPr>
+        <w:t xml:space="preserve"> </w:t>
+      </w:r>
+      <w:proofErr w:type="spellStart"/>
+      <w:r>
+        <w:rPr>
+          <w:b/>
+          <w:bCs/>
+          <w:color w:val="000000"/>
+          <w:sz w:val="22"/>
+          <w:szCs w:val="22"/>
+          <w:lang w:val="en-150" w:eastAsia="en-150"/>
+        </w:rPr>
+        <w:t>платформы</w:t>
+      </w:r>
+      <w:proofErr w:type="spellEnd"/>
+      <w:r>
+        <w:rPr>
+          <w:b/>
+          <w:bCs/>
+          <w:color w:val="000000"/>
+          <w:sz w:val="22"/>
+          <w:szCs w:val="22"/>
+          <w:lang w:val="en-150" w:eastAsia="en-150"/>
+        </w:rPr>
+        <w:t xml:space="preserve"> </w:t>
+      </w:r>
+      <w:proofErr w:type="spellStart"/>
+      <w:r>
+        <w:rPr>
+          <w:b/>
+          <w:bCs/>
+          <w:color w:val="000000"/>
+          <w:sz w:val="22"/>
+          <w:szCs w:val="22"/>
+          <w:lang w:val="en-150" w:eastAsia="en-150"/>
+        </w:rPr>
+        <w:t>колледжа</w:t>
+      </w:r>
+      <w:proofErr w:type="spellEnd"/>
+      <w:r>
+        <w:rPr>
+          <w:b/>
+          <w:bCs/>
+          <w:color w:val="000000"/>
+          <w:sz w:val="22"/>
+          <w:szCs w:val="22"/>
+          <w:lang w:val="en-150" w:eastAsia="en-150"/>
+        </w:rPr>
+        <w:t xml:space="preserve"> с </w:t>
+      </w:r>
+      <w:proofErr w:type="spellStart"/>
+      <w:r>
+        <w:rPr>
+          <w:b/>
+          <w:bCs/>
+          <w:color w:val="000000"/>
+          <w:sz w:val="22"/>
+          <w:szCs w:val="22"/>
+          <w:lang w:val="en-150" w:eastAsia="en-150"/>
+        </w:rPr>
+        <w:t>ролями</w:t>
+      </w:r>
+      <w:proofErr w:type="spellEnd"/>
+      <w:r>
+        <w:rPr>
+          <w:b/>
+          <w:bCs/>
+          <w:color w:val="000000"/>
+          <w:sz w:val="22"/>
+          <w:szCs w:val="22"/>
+          <w:lang w:val="en-150" w:eastAsia="en-150"/>
+        </w:rPr>
+        <w:t xml:space="preserve"> </w:t>
+      </w:r>
+      <w:proofErr w:type="spellStart"/>
+      <w:r>
+        <w:rPr>
+          <w:b/>
+          <w:bCs/>
+          <w:color w:val="000000"/>
+          <w:sz w:val="22"/>
+          <w:szCs w:val="22"/>
+          <w:lang w:val="en-150" w:eastAsia="en-150"/>
+        </w:rPr>
+        <w:t>Администратор</w:t>
+      </w:r>
+      <w:proofErr w:type="spellEnd"/>
+      <w:r>
+        <w:rPr>
+          <w:b/>
+          <w:bCs/>
+          <w:color w:val="000000"/>
+          <w:sz w:val="22"/>
+          <w:szCs w:val="22"/>
+          <w:lang w:val="en-150" w:eastAsia="en-150"/>
+        </w:rPr>
+        <w:t>/</w:t>
+      </w:r>
+      <w:proofErr w:type="spellStart"/>
+      <w:r>
+        <w:rPr>
+          <w:b/>
+          <w:bCs/>
+          <w:color w:val="000000"/>
+          <w:sz w:val="22"/>
+          <w:szCs w:val="22"/>
+          <w:lang w:val="en-150" w:eastAsia="en-150"/>
+        </w:rPr>
+        <w:t>Студент</w:t>
+      </w:r>
+      <w:proofErr w:type="spellEnd"/>
+      <w:r>
+        <w:rPr>
+          <w:b/>
+          <w:bCs/>
+          <w:color w:val="000000"/>
+          <w:sz w:val="22"/>
+          <w:szCs w:val="22"/>
+          <w:lang w:val="en-150" w:eastAsia="en-150"/>
+        </w:rPr>
+        <w:t xml:space="preserve"> и QR-</w:t>
+      </w:r>
+      <w:proofErr w:type="spellStart"/>
+      <w:r>
+        <w:rPr>
+          <w:b/>
+          <w:bCs/>
+          <w:color w:val="000000"/>
+          <w:sz w:val="22"/>
+          <w:szCs w:val="22"/>
+          <w:lang w:val="en-150" w:eastAsia="en-150"/>
+        </w:rPr>
+        <w:t>учётом</w:t>
+      </w:r>
+      <w:proofErr w:type="spellEnd"/>
+      <w:r>
+        <w:rPr>
+          <w:b/>
+          <w:bCs/>
+          <w:color w:val="000000"/>
+          <w:sz w:val="22"/>
+          <w:szCs w:val="22"/>
+          <w:lang w:val="en-150" w:eastAsia="en-150"/>
+        </w:rPr>
+        <w:t xml:space="preserve"> </w:t>
+      </w:r>
+      <w:proofErr w:type="spellStart"/>
+      <w:r>
+        <w:rPr>
+          <w:b/>
+          <w:bCs/>
+          <w:color w:val="000000"/>
+          <w:sz w:val="22"/>
+          <w:szCs w:val="22"/>
+          <w:lang w:val="en-150" w:eastAsia="en-150"/>
+        </w:rPr>
+        <w:t>посещаемости</w:t>
+      </w:r>
+      <w:proofErr w:type="spellEnd"/>
+      <w:r>
+        <w:rPr>
+          <w:b/>
+          <w:bCs/>
+          <w:color w:val="000000"/>
+          <w:sz w:val="22"/>
+          <w:szCs w:val="22"/>
+          <w:lang w:val="en-150" w:eastAsia="en-150"/>
+        </w:rPr>
+        <w:t>»</w:t>
       </w:r>
     </w:p>
     <w:p>
@@ -963,14 +1904,45 @@
           <w:lang w:val="en-150" w:eastAsia="en-150"/>
         </w:rPr>
       </w:pPr>
-      <w:r>
-        <w:rPr>
-          <w:color w:val="000000"/>
-          <w:sz w:val="22"/>
-          <w:szCs w:val="22"/>
-          <w:lang w:val="en-150" w:eastAsia="en-150"/>
-        </w:rPr>
-        <w:t xml:space="preserve">утвержден приказом № </w:t>
+      <w:proofErr w:type="spellStart"/>
+      <w:r>
+        <w:rPr>
+          <w:color w:val="000000"/>
+          <w:sz w:val="22"/>
+          <w:szCs w:val="22"/>
+          <w:lang w:val="en-150" w:eastAsia="en-150"/>
+        </w:rPr>
+        <w:t>утвержден</w:t>
+      </w:r>
+      <w:proofErr w:type="spellEnd"/>
+      <w:r>
+        <w:rPr>
+          <w:color w:val="000000"/>
+          <w:sz w:val="22"/>
+          <w:szCs w:val="22"/>
+          <w:lang w:val="en-150" w:eastAsia="en-150"/>
+        </w:rPr>
+        <w:t xml:space="preserve"> </w:t>
+      </w:r>
+      <w:proofErr w:type="spellStart"/>
+      <w:r>
+        <w:rPr>
+          <w:color w:val="000000"/>
+          <w:sz w:val="22"/>
+          <w:szCs w:val="22"/>
+          <w:lang w:val="en-150" w:eastAsia="en-150"/>
+        </w:rPr>
+        <w:t>приказом</w:t>
+      </w:r>
+      <w:proofErr w:type="spellEnd"/>
+      <w:r>
+        <w:rPr>
+          <w:color w:val="000000"/>
+          <w:sz w:val="22"/>
+          <w:szCs w:val="22"/>
+          <w:lang w:val="en-150" w:eastAsia="en-150"/>
+        </w:rPr>
+        <w:t xml:space="preserve"> № </w:t>
       </w:r>
       <w:r>
         <w:rPr>
@@ -982,14 +1954,25 @@
         </w:rPr>
         <w:t xml:space="preserve">149/91к </w:t>
       </w:r>
-      <w:r>
-        <w:rPr>
-          <w:color w:val="000000"/>
-          <w:sz w:val="22"/>
-          <w:szCs w:val="22"/>
-          <w:lang w:val="en-150" w:eastAsia="en-150"/>
-        </w:rPr>
-        <w:t>от «</w:t>
+      <w:proofErr w:type="spellStart"/>
+      <w:r>
+        <w:rPr>
+          <w:color w:val="000000"/>
+          <w:sz w:val="22"/>
+          <w:szCs w:val="22"/>
+          <w:lang w:val="en-150" w:eastAsia="en-150"/>
+        </w:rPr>
+        <w:t>от</w:t>
+      </w:r>
+      <w:proofErr w:type="spellEnd"/>
+      <w:r>
+        <w:rPr>
+          <w:color w:val="000000"/>
+          <w:sz w:val="22"/>
+          <w:szCs w:val="22"/>
+          <w:lang w:val="en-150" w:eastAsia="en-150"/>
+        </w:rPr>
+        <w:t xml:space="preserve"> «</w:t>
       </w:r>
       <w:r>
         <w:rPr>
@@ -1010,6 +1993,7 @@
         </w:rPr>
         <w:t xml:space="preserve">» </w:t>
       </w:r>
+      <w:proofErr w:type="spellStart"/>
       <w:r>
         <w:rPr>
           <w:color w:val="000000"/>
@@ -1020,6 +2004,7 @@
         </w:rPr>
         <w:t>января</w:t>
       </w:r>
+      <w:proofErr w:type="spellEnd"/>
       <w:r>
         <w:rPr>
           <w:color w:val="000000"/>
@@ -1048,7 +2033,127 @@
           <w:szCs w:val="22"/>
           <w:lang w:val="en-150" w:eastAsia="en-150"/>
         </w:rPr>
-        <w:t>3. Структура курсового проекта включает следующие элементы:</w:t>
+        <w:t xml:space="preserve">3. </w:t>
+      </w:r>
+      <w:proofErr w:type="spellStart"/>
+      <w:r>
+        <w:rPr>
+          <w:color w:val="000000"/>
+          <w:sz w:val="22"/>
+          <w:szCs w:val="22"/>
+          <w:lang w:val="en-150" w:eastAsia="en-150"/>
+        </w:rPr>
+        <w:t>Структура</w:t>
+      </w:r>
+      <w:proofErr w:type="spellEnd"/>
+      <w:r>
+        <w:rPr>
+          <w:color w:val="000000"/>
+          <w:sz w:val="22"/>
+          <w:szCs w:val="22"/>
+          <w:lang w:val="en-150" w:eastAsia="en-150"/>
+        </w:rPr>
+        <w:t xml:space="preserve"> </w:t>
+      </w:r>
+      <w:proofErr w:type="spellStart"/>
+      <w:r>
+        <w:rPr>
+          <w:color w:val="000000"/>
+          <w:sz w:val="22"/>
+          <w:szCs w:val="22"/>
+          <w:lang w:val="en-150" w:eastAsia="en-150"/>
+        </w:rPr>
+        <w:t>курсового</w:t>
+      </w:r>
+      <w:proofErr w:type="spellEnd"/>
+      <w:r>
+        <w:rPr>
+          <w:color w:val="000000"/>
+          <w:sz w:val="22"/>
+          <w:szCs w:val="22"/>
+          <w:lang w:val="en-150" w:eastAsia="en-150"/>
+        </w:rPr>
+        <w:t xml:space="preserve"> </w:t>
+      </w:r>
+      <w:proofErr w:type="spellStart"/>
+      <w:r>
+        <w:rPr>
+          <w:color w:val="000000"/>
+          <w:sz w:val="22"/>
+          <w:szCs w:val="22"/>
+          <w:lang w:val="en-150" w:eastAsia="en-150"/>
+        </w:rPr>
+        <w:t>проекта</w:t>
+      </w:r>
+      <w:proofErr w:type="spellEnd"/>
+      <w:r>
+        <w:rPr>
+          <w:color w:val="000000"/>
+          <w:sz w:val="22"/>
+          <w:szCs w:val="22"/>
+          <w:lang w:val="en-150" w:eastAsia="en-150"/>
+        </w:rPr>
+        <w:t xml:space="preserve"> </w:t>
+      </w:r>
+      <w:proofErr w:type="spellStart"/>
+      <w:r>
+        <w:rPr>
+          <w:color w:val="000000"/>
+          <w:sz w:val="22"/>
+          <w:szCs w:val="22"/>
+          <w:lang w:val="en-150" w:eastAsia="en-150"/>
+        </w:rPr>
+        <w:t>включает</w:t>
+      </w:r>
+      <w:proofErr w:type="spellEnd"/>
+      <w:r>
+        <w:rPr>
+          <w:color w:val="000000"/>
+          <w:sz w:val="22"/>
+          <w:szCs w:val="22"/>
+          <w:lang w:val="en-150" w:eastAsia="en-150"/>
+        </w:rPr>
+        <w:t xml:space="preserve"> </w:t>
+      </w:r>
+      <w:proofErr w:type="spellStart"/>
+      <w:r>
+        <w:rPr>
+          <w:color w:val="000000"/>
+          <w:sz w:val="22"/>
+          <w:szCs w:val="22"/>
+          <w:lang w:val="en-150" w:eastAsia="en-150"/>
+        </w:rPr>
+        <w:t>следующие</w:t>
+      </w:r>
+      <w:proofErr w:type="spellEnd"/>
+      <w:r>
+        <w:rPr>
+          <w:color w:val="000000"/>
+          <w:sz w:val="22"/>
+          <w:szCs w:val="22"/>
+          <w:lang w:val="en-150" w:eastAsia="en-150"/>
+        </w:rPr>
+        <w:t xml:space="preserve"> </w:t>
+      </w:r>
+      <w:proofErr w:type="spellStart"/>
+      <w:r>
+        <w:rPr>
+          <w:color w:val="000000"/>
+          <w:sz w:val="22"/>
+          <w:szCs w:val="22"/>
+          <w:lang w:val="en-150" w:eastAsia="en-150"/>
+        </w:rPr>
+        <w:t>элементы</w:t>
+      </w:r>
+      <w:proofErr w:type="spellEnd"/>
+      <w:r>
+        <w:rPr>
+          <w:color w:val="000000"/>
+          <w:sz w:val="22"/>
+          <w:szCs w:val="22"/>
+          <w:lang w:val="en-150" w:eastAsia="en-150"/>
+        </w:rPr>
+        <w:t>:</w:t>
       </w:r>
     </w:p>
     <w:p>
@@ -1069,7 +2174,327 @@
           <w:szCs w:val="22"/>
           <w:lang w:val="en-150" w:eastAsia="en-150"/>
         </w:rPr>
-        <w:t>- пояснительная записка (титульный лист, задание, содержание, введение, теоретическая/основная часть, заключение, ссылки на используемую литературу, литература).</w:t>
+        <w:t xml:space="preserve">- </w:t>
+      </w:r>
+      <w:proofErr w:type="spellStart"/>
+      <w:r>
+        <w:rPr>
+          <w:color w:val="000000"/>
+          <w:sz w:val="22"/>
+          <w:szCs w:val="22"/>
+          <w:lang w:val="en-150" w:eastAsia="en-150"/>
+        </w:rPr>
+        <w:t>пояснительная</w:t>
+      </w:r>
+      <w:proofErr w:type="spellEnd"/>
+      <w:r>
+        <w:rPr>
+          <w:color w:val="000000"/>
+          <w:sz w:val="22"/>
+          <w:szCs w:val="22"/>
+          <w:lang w:val="en-150" w:eastAsia="en-150"/>
+        </w:rPr>
+        <w:t xml:space="preserve"> </w:t>
+      </w:r>
+      <w:proofErr w:type="spellStart"/>
+      <w:r>
+        <w:rPr>
+          <w:color w:val="000000"/>
+          <w:sz w:val="22"/>
+          <w:szCs w:val="22"/>
+          <w:lang w:val="en-150" w:eastAsia="en-150"/>
+        </w:rPr>
+        <w:t>записка</w:t>
+      </w:r>
+      <w:proofErr w:type="spellEnd"/>
+      <w:r>
+        <w:rPr>
+          <w:color w:val="000000"/>
+          <w:sz w:val="22"/>
+          <w:szCs w:val="22"/>
+          <w:lang w:val="en-150" w:eastAsia="en-150"/>
+        </w:rPr>
+        <w:t xml:space="preserve"> (</w:t>
+      </w:r>
+      <w:proofErr w:type="spellStart"/>
+      <w:r>
+        <w:rPr>
+          <w:color w:val="000000"/>
+          <w:sz w:val="22"/>
+          <w:szCs w:val="22"/>
+          <w:lang w:val="en-150" w:eastAsia="en-150"/>
+        </w:rPr>
+        <w:t>титульный</w:t>
+      </w:r>
+      <w:proofErr w:type="spellEnd"/>
+      <w:r>
+        <w:rPr>
+          <w:color w:val="000000"/>
+          <w:sz w:val="22"/>
+          <w:szCs w:val="22"/>
+          <w:lang w:val="en-150" w:eastAsia="en-150"/>
+        </w:rPr>
+        <w:t xml:space="preserve"> </w:t>
+      </w:r>
+      <w:proofErr w:type="spellStart"/>
+      <w:r>
+        <w:rPr>
+          <w:color w:val="000000"/>
+          <w:sz w:val="22"/>
+          <w:szCs w:val="22"/>
+          <w:lang w:val="en-150" w:eastAsia="en-150"/>
+        </w:rPr>
+        <w:t>лист</w:t>
+      </w:r>
+      <w:proofErr w:type="spellEnd"/>
+      <w:r>
+        <w:rPr>
+          <w:color w:val="000000"/>
+          <w:sz w:val="22"/>
+          <w:szCs w:val="22"/>
+          <w:lang w:val="en-150" w:eastAsia="en-150"/>
+        </w:rPr>
+        <w:t xml:space="preserve">, </w:t>
+      </w:r>
+      <w:proofErr w:type="spellStart"/>
+      <w:r>
+        <w:rPr>
+          <w:color w:val="000000"/>
+          <w:sz w:val="22"/>
+          <w:szCs w:val="22"/>
+          <w:lang w:val="en-150" w:eastAsia="en-150"/>
+        </w:rPr>
+        <w:t>задание</w:t>
+      </w:r>
+      <w:proofErr w:type="spellEnd"/>
+      <w:r>
+        <w:rPr>
+          <w:color w:val="000000"/>
+          <w:sz w:val="22"/>
+          <w:szCs w:val="22"/>
+          <w:lang w:val="en-150" w:eastAsia="en-150"/>
+        </w:rPr>
+        <w:t xml:space="preserve">, </w:t>
+      </w:r>
+      <w:proofErr w:type="spellStart"/>
+      <w:r>
+        <w:rPr>
+          <w:color w:val="000000"/>
+          <w:sz w:val="22"/>
+          <w:szCs w:val="22"/>
+          <w:lang w:val="en-150" w:eastAsia="en-150"/>
+        </w:rPr>
+        <w:t>содержание</w:t>
+      </w:r>
+      <w:proofErr w:type="spellEnd"/>
+      <w:r>
+        <w:rPr>
+          <w:color w:val="000000"/>
+          <w:sz w:val="22"/>
+          <w:szCs w:val="22"/>
+          <w:lang w:val="en-150" w:eastAsia="en-150"/>
+        </w:rPr>
+        <w:t xml:space="preserve">, </w:t>
+      </w:r>
+      <w:proofErr w:type="spellStart"/>
+      <w:r>
+        <w:rPr>
+          <w:color w:val="000000"/>
+          <w:sz w:val="22"/>
+          <w:szCs w:val="22"/>
+          <w:lang w:val="en-150" w:eastAsia="en-150"/>
+        </w:rPr>
+        <w:t>введение</w:t>
+      </w:r>
+      <w:proofErr w:type="spellEnd"/>
+      <w:r>
+        <w:rPr>
+          <w:color w:val="000000"/>
+          <w:sz w:val="22"/>
+          <w:szCs w:val="22"/>
+          <w:lang w:val="en-150" w:eastAsia="en-150"/>
+        </w:rPr>
+        <w:t xml:space="preserve">, </w:t>
+      </w:r>
+      <w:proofErr w:type="spellStart"/>
+      <w:r>
+        <w:rPr>
+          <w:color w:val="000000"/>
+          <w:sz w:val="22"/>
+          <w:szCs w:val="22"/>
+          <w:lang w:val="en-150" w:eastAsia="en-150"/>
+        </w:rPr>
+        <w:t>теоретическая</w:t>
+      </w:r>
+      <w:proofErr w:type="spellEnd"/>
+      <w:r>
+        <w:rPr>
+          <w:color w:val="000000"/>
+          <w:sz w:val="22"/>
+          <w:szCs w:val="22"/>
+          <w:lang w:val="en-150" w:eastAsia="en-150"/>
+        </w:rPr>
+        <w:t>/</w:t>
+      </w:r>
+      <w:proofErr w:type="spellStart"/>
+      <w:r>
+        <w:rPr>
+          <w:color w:val="000000"/>
+          <w:sz w:val="22"/>
+          <w:szCs w:val="22"/>
+          <w:lang w:val="en-150" w:eastAsia="en-150"/>
+        </w:rPr>
+        <w:t>основная</w:t>
+      </w:r>
+      <w:proofErr w:type="spellEnd"/>
+      <w:r>
+        <w:rPr>
+          <w:color w:val="000000"/>
+          <w:sz w:val="22"/>
+          <w:szCs w:val="22"/>
+          <w:lang w:val="en-150" w:eastAsia="en-150"/>
+        </w:rPr>
+        <w:t xml:space="preserve"> </w:t>
+      </w:r>
+      <w:proofErr w:type="spellStart"/>
+      <w:r>
+        <w:rPr>
+          <w:color w:val="000000"/>
+          <w:sz w:val="22"/>
+          <w:szCs w:val="22"/>
+          <w:lang w:val="en-150" w:eastAsia="en-150"/>
+        </w:rPr>
+        <w:t>часть</w:t>
+      </w:r>
+      <w:proofErr w:type="spellEnd"/>
+      <w:r>
+        <w:rPr>
+          <w:color w:val="000000"/>
+          <w:sz w:val="22"/>
+          <w:szCs w:val="22"/>
+          <w:lang w:val="en-150" w:eastAsia="en-150"/>
+        </w:rPr>
+        <w:t xml:space="preserve">, </w:t>
+      </w:r>
+      <w:proofErr w:type="spellStart"/>
+      <w:r>
+        <w:rPr>
+          <w:color w:val="000000"/>
+          <w:sz w:val="22"/>
+          <w:szCs w:val="22"/>
+          <w:lang w:val="en-150" w:eastAsia="en-150"/>
+        </w:rPr>
+        <w:t>заключение</w:t>
+      </w:r>
+      <w:proofErr w:type="spellEnd"/>
+      <w:r>
+        <w:rPr>
+          <w:color w:val="000000"/>
+          <w:sz w:val="22"/>
+          <w:szCs w:val="22"/>
+          <w:lang w:val="en-150" w:eastAsia="en-150"/>
+        </w:rPr>
+        <w:t xml:space="preserve">, </w:t>
+      </w:r>
+      <w:proofErr w:type="spellStart"/>
+      <w:r>
+        <w:rPr>
+          <w:color w:val="000000"/>
+          <w:sz w:val="22"/>
+          <w:szCs w:val="22"/>
+          <w:lang w:val="en-150" w:eastAsia="en-150"/>
+        </w:rPr>
+        <w:t>ссылки</w:t>
+      </w:r>
+      <w:proofErr w:type="spellEnd"/>
+      <w:r>
+        <w:rPr>
+          <w:color w:val="000000"/>
+          <w:sz w:val="22"/>
+          <w:szCs w:val="22"/>
+          <w:lang w:val="en-150" w:eastAsia="en-150"/>
+        </w:rPr>
+        <w:t xml:space="preserve"> </w:t>
+      </w:r>
+      <w:proofErr w:type="spellStart"/>
+      <w:r>
+        <w:rPr>
+          <w:color w:val="000000"/>
+          <w:sz w:val="22"/>
+          <w:szCs w:val="22"/>
+          <w:lang w:val="en-150" w:eastAsia="en-150"/>
+        </w:rPr>
+        <w:t>на</w:t>
+      </w:r>
+      <w:proofErr w:type="spellEnd"/>
+      <w:r>
+        <w:rPr>
+          <w:color w:val="000000"/>
+          <w:sz w:val="22"/>
+          <w:szCs w:val="22"/>
+          <w:lang w:val="en-150" w:eastAsia="en-150"/>
+        </w:rPr>
+        <w:t xml:space="preserve"> </w:t>
+      </w:r>
+      <w:proofErr w:type="spellStart"/>
+      <w:r>
+        <w:rPr>
+          <w:color w:val="000000"/>
+          <w:sz w:val="22"/>
+          <w:szCs w:val="22"/>
+          <w:lang w:val="en-150" w:eastAsia="en-150"/>
+        </w:rPr>
+        <w:t>используемую</w:t>
+      </w:r>
+      <w:proofErr w:type="spellEnd"/>
+      <w:r>
+        <w:rPr>
+          <w:color w:val="000000"/>
+          <w:sz w:val="22"/>
+          <w:szCs w:val="22"/>
+          <w:lang w:val="en-150" w:eastAsia="en-150"/>
+        </w:rPr>
+        <w:t xml:space="preserve"> </w:t>
+      </w:r>
+      <w:proofErr w:type="spellStart"/>
+      <w:r>
+        <w:rPr>
+          <w:color w:val="000000"/>
+          <w:sz w:val="22"/>
+          <w:szCs w:val="22"/>
+          <w:lang w:val="en-150" w:eastAsia="en-150"/>
+        </w:rPr>
+        <w:t>литературу</w:t>
+      </w:r>
+      <w:proofErr w:type="spellEnd"/>
+      <w:r>
+        <w:rPr>
+          <w:color w:val="000000"/>
+          <w:sz w:val="22"/>
+          <w:szCs w:val="22"/>
+          <w:lang w:val="en-150" w:eastAsia="en-150"/>
+        </w:rPr>
+        <w:t xml:space="preserve">, </w:t>
+      </w:r>
+      <w:proofErr w:type="spellStart"/>
+      <w:r>
+        <w:rPr>
+          <w:color w:val="000000"/>
+          <w:sz w:val="22"/>
+          <w:szCs w:val="22"/>
+          <w:lang w:val="en-150" w:eastAsia="en-150"/>
+        </w:rPr>
+        <w:t>литература</w:t>
+      </w:r>
+      <w:proofErr w:type="spellEnd"/>
+      <w:r>
+        <w:rPr>
+          <w:color w:val="000000"/>
+          <w:sz w:val="22"/>
+          <w:szCs w:val="22"/>
+          <w:lang w:val="en-150" w:eastAsia="en-150"/>
+        </w:rPr>
+        <w:t>).</w:t>
       </w:r>
     </w:p>
     <w:p>
@@ -1143,6 +2568,7 @@
           <w:lang w:val="en-150" w:eastAsia="en-150"/>
         </w:rPr>
       </w:pPr>
+      <w:proofErr w:type="spellStart"/>
       <w:r>
         <w:rPr>
           <w:b/>
@@ -1154,6 +2580,7 @@
         </w:rPr>
         <w:t>Введение</w:t>
       </w:r>
+      <w:proofErr w:type="spellEnd"/>
     </w:p>
     <w:p>
       <w:pPr>
@@ -1177,8 +2604,93 @@
           <w:szCs w:val="22"/>
           <w:lang w:val="en-150" w:eastAsia="en-150"/>
         </w:rPr>
-        <w:t>1 Анализ требований и постановка задачи</w:t>
-      </w:r>
+        <w:t>1 </w:t>
+      </w:r>
+      <w:proofErr w:type="spellStart"/>
+      <w:r>
+        <w:rPr>
+          <w:b/>
+          <w:bCs/>
+          <w:color w:val="000000"/>
+          <w:sz w:val="22"/>
+          <w:szCs w:val="22"/>
+          <w:lang w:val="en-150" w:eastAsia="en-150"/>
+        </w:rPr>
+        <w:t>Анализ</w:t>
+      </w:r>
+      <w:proofErr w:type="spellEnd"/>
+      <w:r>
+        <w:rPr>
+          <w:b/>
+          <w:bCs/>
+          <w:color w:val="000000"/>
+          <w:sz w:val="22"/>
+          <w:szCs w:val="22"/>
+          <w:lang w:val="en-150" w:eastAsia="en-150"/>
+        </w:rPr>
+        <w:t xml:space="preserve"> </w:t>
+      </w:r>
+      <w:proofErr w:type="spellStart"/>
+      <w:r>
+        <w:rPr>
+          <w:b/>
+          <w:bCs/>
+          <w:color w:val="000000"/>
+          <w:sz w:val="22"/>
+          <w:szCs w:val="22"/>
+          <w:lang w:val="en-150" w:eastAsia="en-150"/>
+        </w:rPr>
+        <w:t>требований</w:t>
+      </w:r>
+      <w:proofErr w:type="spellEnd"/>
+      <w:r>
+        <w:rPr>
+          <w:b/>
+          <w:bCs/>
+          <w:color w:val="000000"/>
+          <w:sz w:val="22"/>
+          <w:szCs w:val="22"/>
+          <w:lang w:val="en-150" w:eastAsia="en-150"/>
+        </w:rPr>
+        <w:t xml:space="preserve"> и </w:t>
+      </w:r>
+      <w:proofErr w:type="spellStart"/>
+      <w:r>
+        <w:rPr>
+          <w:b/>
+          <w:bCs/>
+          <w:color w:val="000000"/>
+          <w:sz w:val="22"/>
+          <w:szCs w:val="22"/>
+          <w:lang w:val="en-150" w:eastAsia="en-150"/>
+        </w:rPr>
+        <w:t>постановка</w:t>
+      </w:r>
+      <w:proofErr w:type="spellEnd"/>
+      <w:r>
+        <w:rPr>
+          <w:b/>
+          <w:bCs/>
+          <w:color w:val="000000"/>
+          <w:sz w:val="22"/>
+          <w:szCs w:val="22"/>
+          <w:lang w:val="en-150" w:eastAsia="en-150"/>
+        </w:rPr>
+        <w:t xml:space="preserve"> </w:t>
+      </w:r>
+      <w:proofErr w:type="spellStart"/>
+      <w:r>
+        <w:rPr>
+          <w:b/>
+          <w:bCs/>
+          <w:color w:val="000000"/>
+          <w:sz w:val="22"/>
+          <w:szCs w:val="22"/>
+          <w:lang w:val="en-150" w:eastAsia="en-150"/>
+        </w:rPr>
+        <w:t>задачи</w:t>
+      </w:r>
+      <w:proofErr w:type="spellEnd"/>
     </w:p>
     <w:p>
       <w:pPr>
@@ -1200,7 +2712,67 @@
           <w:szCs w:val="22"/>
           <w:lang w:val="en-150" w:eastAsia="en-150"/>
         </w:rPr>
-        <w:t>1.1 Анализ предметной области. </w:t>
+        <w:t xml:space="preserve">1.1 </w:t>
+      </w:r>
+      <w:proofErr w:type="spellStart"/>
+      <w:r>
+        <w:rPr>
+          <w:color w:val="000000"/>
+          <w:sz w:val="22"/>
+          <w:szCs w:val="22"/>
+          <w:lang w:val="en-150" w:eastAsia="en-150"/>
+        </w:rPr>
+        <w:t>Анализ</w:t>
+      </w:r>
+      <w:proofErr w:type="spellEnd"/>
+      <w:r>
+        <w:rPr>
+          <w:color w:val="000000"/>
+          <w:sz w:val="22"/>
+          <w:szCs w:val="22"/>
+          <w:lang w:val="en-150" w:eastAsia="en-150"/>
+        </w:rPr>
+        <w:t xml:space="preserve"> </w:t>
+      </w:r>
+      <w:proofErr w:type="spellStart"/>
+      <w:r>
+        <w:rPr>
+          <w:color w:val="000000"/>
+          <w:sz w:val="22"/>
+          <w:szCs w:val="22"/>
+          <w:lang w:val="en-150" w:eastAsia="en-150"/>
+        </w:rPr>
+        <w:t>предметной</w:t>
+      </w:r>
+      <w:proofErr w:type="spellEnd"/>
+      <w:r>
+        <w:rPr>
+          <w:color w:val="000000"/>
+          <w:sz w:val="22"/>
+          <w:szCs w:val="22"/>
+          <w:lang w:val="en-150" w:eastAsia="en-150"/>
+        </w:rPr>
+        <w:t xml:space="preserve"> </w:t>
+      </w:r>
+      <w:proofErr w:type="spellStart"/>
+      <w:r>
+        <w:rPr>
+          <w:color w:val="000000"/>
+          <w:sz w:val="22"/>
+          <w:szCs w:val="22"/>
+          <w:lang w:val="en-150" w:eastAsia="en-150"/>
+        </w:rPr>
+        <w:t>области</w:t>
+      </w:r>
+      <w:proofErr w:type="spellEnd"/>
+      <w:r>
+        <w:rPr>
+          <w:color w:val="000000"/>
+          <w:sz w:val="22"/>
+          <w:szCs w:val="22"/>
+          <w:lang w:val="en-150" w:eastAsia="en-150"/>
+        </w:rPr>
+        <w:t>. </w:t>
       </w:r>
     </w:p>
     <w:p>
@@ -1223,7 +2795,47 @@
           <w:szCs w:val="22"/>
           <w:lang w:val="en-150" w:eastAsia="en-150"/>
         </w:rPr>
-        <w:t>1.2 Разработка UML диаграмм.</w:t>
+        <w:t xml:space="preserve">1.2 </w:t>
+      </w:r>
+      <w:proofErr w:type="spellStart"/>
+      <w:r>
+        <w:rPr>
+          <w:color w:val="000000"/>
+          <w:sz w:val="22"/>
+          <w:szCs w:val="22"/>
+          <w:lang w:val="en-150" w:eastAsia="en-150"/>
+        </w:rPr>
+        <w:t>Разработка</w:t>
+      </w:r>
+      <w:proofErr w:type="spellEnd"/>
+      <w:r>
+        <w:rPr>
+          <w:color w:val="000000"/>
+          <w:sz w:val="22"/>
+          <w:szCs w:val="22"/>
+          <w:lang w:val="en-150" w:eastAsia="en-150"/>
+        </w:rPr>
+        <w:t xml:space="preserve"> UML </w:t>
+      </w:r>
+      <w:proofErr w:type="spellStart"/>
+      <w:r>
+        <w:rPr>
+          <w:color w:val="000000"/>
+          <w:sz w:val="22"/>
+          <w:szCs w:val="22"/>
+          <w:lang w:val="en-150" w:eastAsia="en-150"/>
+        </w:rPr>
+        <w:t>диаграмм</w:t>
+      </w:r>
+      <w:proofErr w:type="spellEnd"/>
+      <w:r>
+        <w:rPr>
+          <w:color w:val="000000"/>
+          <w:sz w:val="22"/>
+          <w:szCs w:val="22"/>
+          <w:lang w:val="en-150" w:eastAsia="en-150"/>
+        </w:rPr>
+        <w:t>.</w:t>
       </w:r>
     </w:p>
     <w:p>
@@ -1246,7 +2858,67 @@
           <w:szCs w:val="22"/>
           <w:lang w:val="en-150" w:eastAsia="en-150"/>
         </w:rPr>
-        <w:t>1.3 Разработка макета приложения.</w:t>
+        <w:t xml:space="preserve">1.3 </w:t>
+      </w:r>
+      <w:proofErr w:type="spellStart"/>
+      <w:r>
+        <w:rPr>
+          <w:color w:val="000000"/>
+          <w:sz w:val="22"/>
+          <w:szCs w:val="22"/>
+          <w:lang w:val="en-150" w:eastAsia="en-150"/>
+        </w:rPr>
+        <w:t>Разработка</w:t>
+      </w:r>
+      <w:proofErr w:type="spellEnd"/>
+      <w:r>
+        <w:rPr>
+          <w:color w:val="000000"/>
+          <w:sz w:val="22"/>
+          <w:szCs w:val="22"/>
+          <w:lang w:val="en-150" w:eastAsia="en-150"/>
+        </w:rPr>
+        <w:t> </w:t>
+      </w:r>
+      <w:proofErr w:type="spellStart"/>
+      <w:r>
+        <w:rPr>
+          <w:color w:val="000000"/>
+          <w:sz w:val="22"/>
+          <w:szCs w:val="22"/>
+          <w:lang w:val="en-150" w:eastAsia="en-150"/>
+        </w:rPr>
+        <w:t>макета</w:t>
+      </w:r>
+      <w:proofErr w:type="spellEnd"/>
+      <w:r>
+        <w:rPr>
+          <w:color w:val="000000"/>
+          <w:sz w:val="22"/>
+          <w:szCs w:val="22"/>
+          <w:lang w:val="en-150" w:eastAsia="en-150"/>
+        </w:rPr>
+        <w:t xml:space="preserve"> </w:t>
+      </w:r>
+      <w:proofErr w:type="spellStart"/>
+      <w:r>
+        <w:rPr>
+          <w:color w:val="000000"/>
+          <w:sz w:val="22"/>
+          <w:szCs w:val="22"/>
+          <w:lang w:val="en-150" w:eastAsia="en-150"/>
+        </w:rPr>
+        <w:t>приложения</w:t>
+      </w:r>
+      <w:proofErr w:type="spellEnd"/>
+      <w:r>
+        <w:rPr>
+          <w:color w:val="000000"/>
+          <w:sz w:val="22"/>
+          <w:szCs w:val="22"/>
+          <w:lang w:val="en-150" w:eastAsia="en-150"/>
+        </w:rPr>
+        <w:t>.</w:t>
       </w:r>
     </w:p>
     <w:p>
@@ -1271,7 +2943,103 @@
           <w:szCs w:val="22"/>
           <w:lang w:val="en-150" w:eastAsia="en-150"/>
         </w:rPr>
-        <w:t>2 Проектирование и разработка базы данных </w:t>
+        <w:t xml:space="preserve">2 </w:t>
+      </w:r>
+      <w:proofErr w:type="spellStart"/>
+      <w:r>
+        <w:rPr>
+          <w:b/>
+          <w:bCs/>
+          <w:color w:val="000000"/>
+          <w:sz w:val="22"/>
+          <w:szCs w:val="22"/>
+          <w:lang w:val="en-150" w:eastAsia="en-150"/>
+        </w:rPr>
+        <w:t>Проектирование</w:t>
+      </w:r>
+      <w:proofErr w:type="spellEnd"/>
+      <w:r>
+        <w:rPr>
+          <w:b/>
+          <w:bCs/>
+          <w:color w:val="000000"/>
+          <w:sz w:val="22"/>
+          <w:szCs w:val="22"/>
+          <w:lang w:val="en-150" w:eastAsia="en-150"/>
+        </w:rPr>
+        <w:t xml:space="preserve"> и </w:t>
+      </w:r>
+      <w:proofErr w:type="spellStart"/>
+      <w:r>
+        <w:rPr>
+          <w:b/>
+          <w:bCs/>
+          <w:color w:val="000000"/>
+          <w:sz w:val="22"/>
+          <w:szCs w:val="22"/>
+          <w:lang w:val="en-150" w:eastAsia="en-150"/>
+        </w:rPr>
+        <w:t>разработка</w:t>
+      </w:r>
+      <w:proofErr w:type="spellEnd"/>
+      <w:r>
+        <w:rPr>
+          <w:b/>
+          <w:bCs/>
+          <w:color w:val="000000"/>
+          <w:sz w:val="22"/>
+          <w:szCs w:val="22"/>
+          <w:lang w:val="en-150" w:eastAsia="en-150"/>
+        </w:rPr>
+        <w:t xml:space="preserve"> </w:t>
+      </w:r>
+      <w:proofErr w:type="spellStart"/>
+      <w:r>
+        <w:rPr>
+          <w:b/>
+          <w:bCs/>
+          <w:color w:val="000000"/>
+          <w:sz w:val="22"/>
+          <w:szCs w:val="22"/>
+          <w:lang w:val="en-150" w:eastAsia="en-150"/>
+        </w:rPr>
+        <w:t>базы</w:t>
+      </w:r>
+      <w:proofErr w:type="spellEnd"/>
+      <w:r>
+        <w:rPr>
+          <w:b/>
+          <w:bCs/>
+          <w:color w:val="000000"/>
+          <w:sz w:val="22"/>
+          <w:szCs w:val="22"/>
+          <w:lang w:val="en-150" w:eastAsia="en-150"/>
+        </w:rPr>
+        <w:t xml:space="preserve"> </w:t>
+      </w:r>
+      <w:proofErr w:type="spellStart"/>
+      <w:r>
+        <w:rPr>
+          <w:b/>
+          <w:bCs/>
+          <w:color w:val="000000"/>
+          <w:sz w:val="22"/>
+          <w:szCs w:val="22"/>
+          <w:lang w:val="en-150" w:eastAsia="en-150"/>
+        </w:rPr>
+        <w:t>данных</w:t>
+      </w:r>
+      <w:proofErr w:type="spellEnd"/>
+      <w:r>
+        <w:rPr>
+          <w:b/>
+          <w:bCs/>
+          <w:color w:val="000000"/>
+          <w:sz w:val="22"/>
+          <w:szCs w:val="22"/>
+          <w:lang w:val="en-150" w:eastAsia="en-150"/>
+        </w:rPr>
+        <w:t> </w:t>
       </w:r>
     </w:p>
     <w:p>
@@ -1294,7 +3062,127 @@
           <w:szCs w:val="22"/>
           <w:lang w:val="en-150" w:eastAsia="en-150"/>
         </w:rPr>
-        <w:t>2.1 Разработка ER-диаграммы на основе сырых данных.</w:t>
+        <w:t xml:space="preserve">2.1 </w:t>
+      </w:r>
+      <w:proofErr w:type="spellStart"/>
+      <w:r>
+        <w:rPr>
+          <w:color w:val="000000"/>
+          <w:sz w:val="22"/>
+          <w:szCs w:val="22"/>
+          <w:lang w:val="en-150" w:eastAsia="en-150"/>
+        </w:rPr>
+        <w:t>Разработка</w:t>
+      </w:r>
+      <w:proofErr w:type="spellEnd"/>
+      <w:r>
+        <w:rPr>
+          <w:color w:val="000000"/>
+          <w:sz w:val="22"/>
+          <w:szCs w:val="22"/>
+          <w:lang w:val="en-150" w:eastAsia="en-150"/>
+        </w:rPr>
+        <w:t xml:space="preserve"> ER-</w:t>
+      </w:r>
+      <w:proofErr w:type="spellStart"/>
+      <w:r>
+        <w:rPr>
+          <w:color w:val="000000"/>
+          <w:sz w:val="22"/>
+          <w:szCs w:val="22"/>
+          <w:lang w:val="en-150" w:eastAsia="en-150"/>
+        </w:rPr>
+        <w:t>диаграммы</w:t>
+      </w:r>
+      <w:proofErr w:type="spellEnd"/>
+      <w:r>
+        <w:rPr>
+          <w:color w:val="000000"/>
+          <w:sz w:val="22"/>
+          <w:szCs w:val="22"/>
+          <w:lang w:val="en-150" w:eastAsia="en-150"/>
+        </w:rPr>
+        <w:t xml:space="preserve"> </w:t>
+      </w:r>
+      <w:proofErr w:type="spellStart"/>
+      <w:r>
+        <w:rPr>
+          <w:color w:val="000000"/>
+          <w:sz w:val="22"/>
+          <w:szCs w:val="22"/>
+          <w:lang w:val="en-150" w:eastAsia="en-150"/>
+        </w:rPr>
+        <w:t>на</w:t>
+      </w:r>
+      <w:proofErr w:type="spellEnd"/>
+      <w:r>
+        <w:rPr>
+          <w:color w:val="000000"/>
+          <w:sz w:val="22"/>
+          <w:szCs w:val="22"/>
+          <w:lang w:val="en-150" w:eastAsia="en-150"/>
+        </w:rPr>
+        <w:t xml:space="preserve"> </w:t>
+      </w:r>
+      <w:proofErr w:type="spellStart"/>
+      <w:r>
+        <w:rPr>
+          <w:color w:val="000000"/>
+          <w:sz w:val="22"/>
+          <w:szCs w:val="22"/>
+          <w:lang w:val="en-150" w:eastAsia="en-150"/>
+        </w:rPr>
+        <w:t>основе</w:t>
+      </w:r>
+      <w:proofErr w:type="spellEnd"/>
+      <w:r>
+        <w:rPr>
+          <w:color w:val="000000"/>
+          <w:sz w:val="22"/>
+          <w:szCs w:val="22"/>
+          <w:lang w:val="en-150" w:eastAsia="en-150"/>
+        </w:rPr>
+        <w:t xml:space="preserve"> </w:t>
+      </w:r>
+      <w:proofErr w:type="spellStart"/>
+      <w:r>
+        <w:rPr>
+          <w:color w:val="000000"/>
+          <w:sz w:val="22"/>
+          <w:szCs w:val="22"/>
+          <w:lang w:val="en-150" w:eastAsia="en-150"/>
+        </w:rPr>
+        <w:t>сырых</w:t>
+      </w:r>
+      <w:proofErr w:type="spellEnd"/>
+      <w:r>
+        <w:rPr>
+          <w:color w:val="000000"/>
+          <w:sz w:val="22"/>
+          <w:szCs w:val="22"/>
+          <w:lang w:val="en-150" w:eastAsia="en-150"/>
+        </w:rPr>
+        <w:t xml:space="preserve"> </w:t>
+      </w:r>
+      <w:proofErr w:type="spellStart"/>
+      <w:r>
+        <w:rPr>
+          <w:color w:val="000000"/>
+          <w:sz w:val="22"/>
+          <w:szCs w:val="22"/>
+          <w:lang w:val="en-150" w:eastAsia="en-150"/>
+        </w:rPr>
+        <w:t>данных</w:t>
+      </w:r>
+      <w:proofErr w:type="spellEnd"/>
+      <w:r>
+        <w:rPr>
+          <w:color w:val="000000"/>
+          <w:sz w:val="22"/>
+          <w:szCs w:val="22"/>
+          <w:lang w:val="en-150" w:eastAsia="en-150"/>
+        </w:rPr>
+        <w:t>.</w:t>
       </w:r>
     </w:p>
     <w:p>
@@ -1317,7 +3205,107 @@
           <w:szCs w:val="22"/>
           <w:lang w:val="en-150" w:eastAsia="en-150"/>
         </w:rPr>
-        <w:t>2.2 Разработка физической модели базы данных в MS SQL Server.</w:t>
+        <w:t xml:space="preserve">2.2 </w:t>
+      </w:r>
+      <w:proofErr w:type="spellStart"/>
+      <w:r>
+        <w:rPr>
+          <w:color w:val="000000"/>
+          <w:sz w:val="22"/>
+          <w:szCs w:val="22"/>
+          <w:lang w:val="en-150" w:eastAsia="en-150"/>
+        </w:rPr>
+        <w:t>Разработка</w:t>
+      </w:r>
+      <w:proofErr w:type="spellEnd"/>
+      <w:r>
+        <w:rPr>
+          <w:color w:val="000000"/>
+          <w:sz w:val="22"/>
+          <w:szCs w:val="22"/>
+          <w:lang w:val="en-150" w:eastAsia="en-150"/>
+        </w:rPr>
+        <w:t xml:space="preserve"> </w:t>
+      </w:r>
+      <w:proofErr w:type="spellStart"/>
+      <w:r>
+        <w:rPr>
+          <w:color w:val="000000"/>
+          <w:sz w:val="22"/>
+          <w:szCs w:val="22"/>
+          <w:lang w:val="en-150" w:eastAsia="en-150"/>
+        </w:rPr>
+        <w:t>физической</w:t>
+      </w:r>
+      <w:proofErr w:type="spellEnd"/>
+      <w:r>
+        <w:rPr>
+          <w:color w:val="000000"/>
+          <w:sz w:val="22"/>
+          <w:szCs w:val="22"/>
+          <w:lang w:val="en-150" w:eastAsia="en-150"/>
+        </w:rPr>
+        <w:t xml:space="preserve"> </w:t>
+      </w:r>
+      <w:proofErr w:type="spellStart"/>
+      <w:r>
+        <w:rPr>
+          <w:color w:val="000000"/>
+          <w:sz w:val="22"/>
+          <w:szCs w:val="22"/>
+          <w:lang w:val="en-150" w:eastAsia="en-150"/>
+        </w:rPr>
+        <w:t>модели</w:t>
+      </w:r>
+      <w:proofErr w:type="spellEnd"/>
+      <w:r>
+        <w:rPr>
+          <w:color w:val="000000"/>
+          <w:sz w:val="22"/>
+          <w:szCs w:val="22"/>
+          <w:lang w:val="en-150" w:eastAsia="en-150"/>
+        </w:rPr>
+        <w:t xml:space="preserve"> </w:t>
+      </w:r>
+      <w:proofErr w:type="spellStart"/>
+      <w:r>
+        <w:rPr>
+          <w:color w:val="000000"/>
+          <w:sz w:val="22"/>
+          <w:szCs w:val="22"/>
+          <w:lang w:val="en-150" w:eastAsia="en-150"/>
+        </w:rPr>
+        <w:t>базы</w:t>
+      </w:r>
+      <w:proofErr w:type="spellEnd"/>
+      <w:r>
+        <w:rPr>
+          <w:color w:val="000000"/>
+          <w:sz w:val="22"/>
+          <w:szCs w:val="22"/>
+          <w:lang w:val="en-150" w:eastAsia="en-150"/>
+        </w:rPr>
+        <w:t xml:space="preserve"> </w:t>
+      </w:r>
+      <w:proofErr w:type="spellStart"/>
+      <w:r>
+        <w:rPr>
+          <w:color w:val="000000"/>
+          <w:sz w:val="22"/>
+          <w:szCs w:val="22"/>
+          <w:lang w:val="en-150" w:eastAsia="en-150"/>
+        </w:rPr>
+        <w:t>данных</w:t>
+      </w:r>
+      <w:proofErr w:type="spellEnd"/>
+      <w:r>
+        <w:rPr>
+          <w:color w:val="000000"/>
+          <w:sz w:val="22"/>
+          <w:szCs w:val="22"/>
+          <w:lang w:val="en-150" w:eastAsia="en-150"/>
+        </w:rPr>
+        <w:t xml:space="preserve"> в MS SQL Server.</w:t>
       </w:r>
     </w:p>
     <w:p>
@@ -1340,7 +3328,87 @@
           <w:szCs w:val="22"/>
           <w:lang w:val="en-150" w:eastAsia="en-150"/>
         </w:rPr>
-        <w:t>2.3 Разработка и именование связей и ограничений.</w:t>
+        <w:t xml:space="preserve">2.3 </w:t>
+      </w:r>
+      <w:proofErr w:type="spellStart"/>
+      <w:r>
+        <w:rPr>
+          <w:color w:val="000000"/>
+          <w:sz w:val="22"/>
+          <w:szCs w:val="22"/>
+          <w:lang w:val="en-150" w:eastAsia="en-150"/>
+        </w:rPr>
+        <w:t>Разработка</w:t>
+      </w:r>
+      <w:proofErr w:type="spellEnd"/>
+      <w:r>
+        <w:rPr>
+          <w:color w:val="000000"/>
+          <w:sz w:val="22"/>
+          <w:szCs w:val="22"/>
+          <w:lang w:val="en-150" w:eastAsia="en-150"/>
+        </w:rPr>
+        <w:t xml:space="preserve"> и </w:t>
+      </w:r>
+      <w:proofErr w:type="spellStart"/>
+      <w:r>
+        <w:rPr>
+          <w:color w:val="000000"/>
+          <w:sz w:val="22"/>
+          <w:szCs w:val="22"/>
+          <w:lang w:val="en-150" w:eastAsia="en-150"/>
+        </w:rPr>
+        <w:t>именование</w:t>
+      </w:r>
+      <w:proofErr w:type="spellEnd"/>
+      <w:r>
+        <w:rPr>
+          <w:color w:val="000000"/>
+          <w:sz w:val="22"/>
+          <w:szCs w:val="22"/>
+          <w:lang w:val="en-150" w:eastAsia="en-150"/>
+        </w:rPr>
+        <w:t xml:space="preserve"> </w:t>
+      </w:r>
+      <w:proofErr w:type="spellStart"/>
+      <w:r>
+        <w:rPr>
+          <w:color w:val="000000"/>
+          <w:sz w:val="22"/>
+          <w:szCs w:val="22"/>
+          <w:lang w:val="en-150" w:eastAsia="en-150"/>
+        </w:rPr>
+        <w:t>связей</w:t>
+      </w:r>
+      <w:proofErr w:type="spellEnd"/>
+      <w:r>
+        <w:rPr>
+          <w:color w:val="000000"/>
+          <w:sz w:val="22"/>
+          <w:szCs w:val="22"/>
+          <w:lang w:val="en-150" w:eastAsia="en-150"/>
+        </w:rPr>
+        <w:t xml:space="preserve"> и </w:t>
+      </w:r>
+      <w:proofErr w:type="spellStart"/>
+      <w:r>
+        <w:rPr>
+          <w:color w:val="000000"/>
+          <w:sz w:val="22"/>
+          <w:szCs w:val="22"/>
+          <w:lang w:val="en-150" w:eastAsia="en-150"/>
+        </w:rPr>
+        <w:t>ограничений</w:t>
+      </w:r>
+      <w:proofErr w:type="spellEnd"/>
+      <w:r>
+        <w:rPr>
+          <w:color w:val="000000"/>
+          <w:sz w:val="22"/>
+          <w:szCs w:val="22"/>
+          <w:lang w:val="en-150" w:eastAsia="en-150"/>
+        </w:rPr>
+        <w:t>.</w:t>
       </w:r>
     </w:p>
     <w:p>
@@ -1365,8 +3433,69 @@
           <w:szCs w:val="22"/>
           <w:lang w:val="en-150" w:eastAsia="en-150"/>
         </w:rPr>
-        <w:t>3 Проектирование и разработка приложения</w:t>
-      </w:r>
+        <w:t xml:space="preserve">3 </w:t>
+      </w:r>
+      <w:proofErr w:type="spellStart"/>
+      <w:r>
+        <w:rPr>
+          <w:b/>
+          <w:bCs/>
+          <w:color w:val="000000"/>
+          <w:sz w:val="22"/>
+          <w:szCs w:val="22"/>
+          <w:lang w:val="en-150" w:eastAsia="en-150"/>
+        </w:rPr>
+        <w:t>Проектирование</w:t>
+      </w:r>
+      <w:proofErr w:type="spellEnd"/>
+      <w:r>
+        <w:rPr>
+          <w:b/>
+          <w:bCs/>
+          <w:color w:val="000000"/>
+          <w:sz w:val="22"/>
+          <w:szCs w:val="22"/>
+          <w:lang w:val="en-150" w:eastAsia="en-150"/>
+        </w:rPr>
+        <w:t xml:space="preserve"> и </w:t>
+      </w:r>
+      <w:proofErr w:type="spellStart"/>
+      <w:r>
+        <w:rPr>
+          <w:b/>
+          <w:bCs/>
+          <w:color w:val="000000"/>
+          <w:sz w:val="22"/>
+          <w:szCs w:val="22"/>
+          <w:lang w:val="en-150" w:eastAsia="en-150"/>
+        </w:rPr>
+        <w:t>разработка</w:t>
+      </w:r>
+      <w:proofErr w:type="spellEnd"/>
+      <w:r>
+        <w:rPr>
+          <w:b/>
+          <w:bCs/>
+          <w:color w:val="000000"/>
+          <w:sz w:val="22"/>
+          <w:szCs w:val="22"/>
+          <w:lang w:val="en-150" w:eastAsia="en-150"/>
+        </w:rPr>
+        <w:t xml:space="preserve"> </w:t>
+      </w:r>
+      <w:proofErr w:type="spellStart"/>
+      <w:r>
+        <w:rPr>
+          <w:b/>
+          <w:bCs/>
+          <w:color w:val="000000"/>
+          <w:sz w:val="22"/>
+          <w:szCs w:val="22"/>
+          <w:lang w:val="en-150" w:eastAsia="en-150"/>
+        </w:rPr>
+        <w:t>приложения</w:t>
+      </w:r>
+      <w:proofErr w:type="spellEnd"/>
     </w:p>
     <w:p>
       <w:pPr>
@@ -1388,7 +3517,67 @@
           <w:szCs w:val="22"/>
           <w:lang w:val="en-150" w:eastAsia="en-150"/>
         </w:rPr>
-        <w:t>3.1 Разработка прототипа приложения.</w:t>
+        <w:t xml:space="preserve">3.1 </w:t>
+      </w:r>
+      <w:proofErr w:type="spellStart"/>
+      <w:r>
+        <w:rPr>
+          <w:color w:val="000000"/>
+          <w:sz w:val="22"/>
+          <w:szCs w:val="22"/>
+          <w:lang w:val="en-150" w:eastAsia="en-150"/>
+        </w:rPr>
+        <w:t>Разработка</w:t>
+      </w:r>
+      <w:proofErr w:type="spellEnd"/>
+      <w:r>
+        <w:rPr>
+          <w:color w:val="000000"/>
+          <w:sz w:val="22"/>
+          <w:szCs w:val="22"/>
+          <w:lang w:val="en-150" w:eastAsia="en-150"/>
+        </w:rPr>
+        <w:t xml:space="preserve"> </w:t>
+      </w:r>
+      <w:proofErr w:type="spellStart"/>
+      <w:r>
+        <w:rPr>
+          <w:color w:val="000000"/>
+          <w:sz w:val="22"/>
+          <w:szCs w:val="22"/>
+          <w:lang w:val="en-150" w:eastAsia="en-150"/>
+        </w:rPr>
+        <w:t>прототипа</w:t>
+      </w:r>
+      <w:proofErr w:type="spellEnd"/>
+      <w:r>
+        <w:rPr>
+          <w:color w:val="000000"/>
+          <w:sz w:val="22"/>
+          <w:szCs w:val="22"/>
+          <w:lang w:val="en-150" w:eastAsia="en-150"/>
+        </w:rPr>
+        <w:t xml:space="preserve"> </w:t>
+      </w:r>
+      <w:proofErr w:type="spellStart"/>
+      <w:r>
+        <w:rPr>
+          <w:color w:val="000000"/>
+          <w:sz w:val="22"/>
+          <w:szCs w:val="22"/>
+          <w:lang w:val="en-150" w:eastAsia="en-150"/>
+        </w:rPr>
+        <w:t>приложения</w:t>
+      </w:r>
+      <w:proofErr w:type="spellEnd"/>
+      <w:r>
+        <w:rPr>
+          <w:color w:val="000000"/>
+          <w:sz w:val="22"/>
+          <w:szCs w:val="22"/>
+          <w:lang w:val="en-150" w:eastAsia="en-150"/>
+        </w:rPr>
+        <w:t>.</w:t>
       </w:r>
     </w:p>
     <w:p>
@@ -1411,7 +3600,67 @@
           <w:szCs w:val="22"/>
           <w:lang w:val="en-150" w:eastAsia="en-150"/>
         </w:rPr>
-        <w:t>3.2 Разработка описания проекта в GitHub.</w:t>
+        <w:t xml:space="preserve">3.2 </w:t>
+      </w:r>
+      <w:proofErr w:type="spellStart"/>
+      <w:r>
+        <w:rPr>
+          <w:color w:val="000000"/>
+          <w:sz w:val="22"/>
+          <w:szCs w:val="22"/>
+          <w:lang w:val="en-150" w:eastAsia="en-150"/>
+        </w:rPr>
+        <w:t>Разработка</w:t>
+      </w:r>
+      <w:proofErr w:type="spellEnd"/>
+      <w:r>
+        <w:rPr>
+          <w:color w:val="000000"/>
+          <w:sz w:val="22"/>
+          <w:szCs w:val="22"/>
+          <w:lang w:val="en-150" w:eastAsia="en-150"/>
+        </w:rPr>
+        <w:t xml:space="preserve"> </w:t>
+      </w:r>
+      <w:proofErr w:type="spellStart"/>
+      <w:r>
+        <w:rPr>
+          <w:color w:val="000000"/>
+          <w:sz w:val="22"/>
+          <w:szCs w:val="22"/>
+          <w:lang w:val="en-150" w:eastAsia="en-150"/>
+        </w:rPr>
+        <w:t>описания</w:t>
+      </w:r>
+      <w:proofErr w:type="spellEnd"/>
+      <w:r>
+        <w:rPr>
+          <w:color w:val="000000"/>
+          <w:sz w:val="22"/>
+          <w:szCs w:val="22"/>
+          <w:lang w:val="en-150" w:eastAsia="en-150"/>
+        </w:rPr>
+        <w:t xml:space="preserve"> </w:t>
+      </w:r>
+      <w:proofErr w:type="spellStart"/>
+      <w:r>
+        <w:rPr>
+          <w:color w:val="000000"/>
+          <w:sz w:val="22"/>
+          <w:szCs w:val="22"/>
+          <w:lang w:val="en-150" w:eastAsia="en-150"/>
+        </w:rPr>
+        <w:t>проекта</w:t>
+      </w:r>
+      <w:proofErr w:type="spellEnd"/>
+      <w:r>
+        <w:rPr>
+          <w:color w:val="000000"/>
+          <w:sz w:val="22"/>
+          <w:szCs w:val="22"/>
+          <w:lang w:val="en-150" w:eastAsia="en-150"/>
+        </w:rPr>
+        <w:t xml:space="preserve"> в GitHub.</w:t>
       </w:r>
     </w:p>
     <w:p>
@@ -1427,6 +3676,7 @@
           <w:lang w:val="en-150" w:eastAsia="en-150"/>
         </w:rPr>
       </w:pPr>
+      <w:proofErr w:type="spellStart"/>
       <w:r>
         <w:rPr>
           <w:b/>
@@ -1438,6 +3688,7 @@
         </w:rPr>
         <w:t>Заключение</w:t>
       </w:r>
+      <w:proofErr w:type="spellEnd"/>
     </w:p>
     <w:p>
       <w:pPr>
@@ -1451,6 +3702,7 @@
           <w:lang w:val="en-150" w:eastAsia="en-150"/>
         </w:rPr>
       </w:pPr>
+      <w:proofErr w:type="spellStart"/>
       <w:r>
         <w:rPr>
           <w:b/>
@@ -1462,6 +3714,7 @@
         </w:rPr>
         <w:t>Литература</w:t>
       </w:r>
+      <w:proofErr w:type="spellEnd"/>
     </w:p>
     <w:p>
       <w:pPr>
@@ -1516,14 +3769,105 @@
           <w:lang w:val="en-150" w:eastAsia="en-150"/>
         </w:rPr>
       </w:pPr>
-      <w:r>
-        <w:rPr>
-          <w:color w:val="000000"/>
-          <w:sz w:val="22"/>
-          <w:szCs w:val="22"/>
-          <w:lang w:val="en-150" w:eastAsia="en-150"/>
-        </w:rPr>
-        <w:t>Рассмотрено на заседании ЦК № 5 «Информационные технологии»</w:t>
+      <w:proofErr w:type="spellStart"/>
+      <w:r>
+        <w:rPr>
+          <w:color w:val="000000"/>
+          <w:sz w:val="22"/>
+          <w:szCs w:val="22"/>
+          <w:lang w:val="en-150" w:eastAsia="en-150"/>
+        </w:rPr>
+        <w:t>Рассмотрено</w:t>
+      </w:r>
+      <w:proofErr w:type="spellEnd"/>
+      <w:r>
+        <w:rPr>
+          <w:color w:val="000000"/>
+          <w:sz w:val="22"/>
+          <w:szCs w:val="22"/>
+          <w:lang w:val="en-150" w:eastAsia="en-150"/>
+        </w:rPr>
+        <w:t xml:space="preserve"> </w:t>
+      </w:r>
+      <w:proofErr w:type="spellStart"/>
+      <w:r>
+        <w:rPr>
+          <w:color w:val="000000"/>
+          <w:sz w:val="22"/>
+          <w:szCs w:val="22"/>
+          <w:lang w:val="en-150" w:eastAsia="en-150"/>
+        </w:rPr>
+        <w:t>на</w:t>
+      </w:r>
+      <w:proofErr w:type="spellEnd"/>
+      <w:r>
+        <w:rPr>
+          <w:color w:val="000000"/>
+          <w:sz w:val="22"/>
+          <w:szCs w:val="22"/>
+          <w:lang w:val="en-150" w:eastAsia="en-150"/>
+        </w:rPr>
+        <w:t xml:space="preserve"> </w:t>
+      </w:r>
+      <w:proofErr w:type="spellStart"/>
+      <w:r>
+        <w:rPr>
+          <w:color w:val="000000"/>
+          <w:sz w:val="22"/>
+          <w:szCs w:val="22"/>
+          <w:lang w:val="en-150" w:eastAsia="en-150"/>
+        </w:rPr>
+        <w:t>заседании</w:t>
+      </w:r>
+      <w:proofErr w:type="spellEnd"/>
+      <w:r>
+        <w:rPr>
+          <w:color w:val="000000"/>
+          <w:sz w:val="22"/>
+          <w:szCs w:val="22"/>
+          <w:lang w:val="en-150" w:eastAsia="en-150"/>
+        </w:rPr>
+        <w:t xml:space="preserve"> ЦК № 5 «</w:t>
+      </w:r>
+      <w:proofErr w:type="spellStart"/>
+      <w:r>
+        <w:rPr>
+          <w:color w:val="000000"/>
+          <w:sz w:val="22"/>
+          <w:szCs w:val="22"/>
+          <w:lang w:val="en-150" w:eastAsia="en-150"/>
+        </w:rPr>
+        <w:t>Информационные</w:t>
+      </w:r>
+      <w:proofErr w:type="spellEnd"/>
+      <w:r>
+        <w:rPr>
+          <w:color w:val="000000"/>
+          <w:sz w:val="22"/>
+          <w:szCs w:val="22"/>
+          <w:lang w:val="en-150" w:eastAsia="en-150"/>
+        </w:rPr>
+        <w:t xml:space="preserve"> </w:t>
+      </w:r>
+      <w:proofErr w:type="spellStart"/>
+      <w:r>
+        <w:rPr>
+          <w:color w:val="000000"/>
+          <w:sz w:val="22"/>
+          <w:szCs w:val="22"/>
+          <w:lang w:val="en-150" w:eastAsia="en-150"/>
+        </w:rPr>
+        <w:t>технологии</w:t>
+      </w:r>
+      <w:proofErr w:type="spellEnd"/>
+      <w:r>
+        <w:rPr>
+          <w:color w:val="000000"/>
+          <w:sz w:val="22"/>
+          <w:szCs w:val="22"/>
+          <w:lang w:val="en-150" w:eastAsia="en-150"/>
+        </w:rPr>
+        <w:t>»</w:t>
       </w:r>
     </w:p>
     <w:p>
@@ -1538,15 +3882,77 @@
           <w:lang w:val="en-150" w:eastAsia="en-150"/>
         </w:rPr>
       </w:pPr>
-      <w:r>
-        <w:rPr>
-          <w:color w:val="000000"/>
-          <w:sz w:val="22"/>
-          <w:szCs w:val="22"/>
-          <w:lang w:val="en-150" w:eastAsia="en-150"/>
-        </w:rPr>
-        <w:t>протокол № 5 от «10» декабря 2025 года</w:t>
-      </w:r>
+      <w:proofErr w:type="spellStart"/>
+      <w:r>
+        <w:rPr>
+          <w:color w:val="000000"/>
+          <w:sz w:val="22"/>
+          <w:szCs w:val="22"/>
+          <w:lang w:val="en-150" w:eastAsia="en-150"/>
+        </w:rPr>
+        <w:t>протокол</w:t>
+      </w:r>
+      <w:proofErr w:type="spellEnd"/>
+      <w:r>
+        <w:rPr>
+          <w:color w:val="000000"/>
+          <w:sz w:val="22"/>
+          <w:szCs w:val="22"/>
+          <w:lang w:val="en-150" w:eastAsia="en-150"/>
+        </w:rPr>
+        <w:t xml:space="preserve"> № 5 </w:t>
+      </w:r>
+      <w:proofErr w:type="spellStart"/>
+      <w:r>
+        <w:rPr>
+          <w:color w:val="000000"/>
+          <w:sz w:val="22"/>
+          <w:szCs w:val="22"/>
+          <w:lang w:val="en-150" w:eastAsia="en-150"/>
+        </w:rPr>
+        <w:t>от</w:t>
+      </w:r>
+      <w:proofErr w:type="spellEnd"/>
+      <w:r>
+        <w:rPr>
+          <w:color w:val="000000"/>
+          <w:sz w:val="22"/>
+          <w:szCs w:val="22"/>
+          <w:lang w:val="en-150" w:eastAsia="en-150"/>
+        </w:rPr>
+        <w:t xml:space="preserve"> «10» </w:t>
+      </w:r>
+      <w:proofErr w:type="spellStart"/>
+      <w:r>
+        <w:rPr>
+          <w:color w:val="000000"/>
+          <w:sz w:val="22"/>
+          <w:szCs w:val="22"/>
+          <w:lang w:val="en-150" w:eastAsia="en-150"/>
+        </w:rPr>
+        <w:t>декабря</w:t>
+      </w:r>
+      <w:proofErr w:type="spellEnd"/>
+      <w:r>
+        <w:rPr>
+          <w:color w:val="000000"/>
+          <w:sz w:val="22"/>
+          <w:szCs w:val="22"/>
+          <w:lang w:val="en-150" w:eastAsia="en-150"/>
+        </w:rPr>
+        <w:t xml:space="preserve"> 2025 </w:t>
+      </w:r>
+      <w:proofErr w:type="spellStart"/>
+      <w:r>
+        <w:rPr>
+          <w:color w:val="000000"/>
+          <w:sz w:val="22"/>
+          <w:szCs w:val="22"/>
+          <w:lang w:val="en-150" w:eastAsia="en-150"/>
+        </w:rPr>
+        <w:t>года</w:t>
+      </w:r>
+      <w:proofErr w:type="spellEnd"/>
     </w:p>
     <w:p>
       <w:pPr>
@@ -1560,15 +3966,77 @@
           <w:lang w:val="en-150" w:eastAsia="en-150"/>
         </w:rPr>
       </w:pPr>
-      <w:r>
-        <w:rPr>
-          <w:color w:val="000000"/>
-          <w:sz w:val="22"/>
-          <w:szCs w:val="22"/>
-          <w:lang w:val="en-150" w:eastAsia="en-150"/>
-        </w:rPr>
-        <w:t>Дата выдачи задания «___» ___ 2026 года</w:t>
-      </w:r>
+      <w:proofErr w:type="spellStart"/>
+      <w:r>
+        <w:rPr>
+          <w:color w:val="000000"/>
+          <w:sz w:val="22"/>
+          <w:szCs w:val="22"/>
+          <w:lang w:val="en-150" w:eastAsia="en-150"/>
+        </w:rPr>
+        <w:t>Дата</w:t>
+      </w:r>
+      <w:proofErr w:type="spellEnd"/>
+      <w:r>
+        <w:rPr>
+          <w:color w:val="000000"/>
+          <w:sz w:val="22"/>
+          <w:szCs w:val="22"/>
+          <w:lang w:val="en-150" w:eastAsia="en-150"/>
+        </w:rPr>
+        <w:t xml:space="preserve"> </w:t>
+      </w:r>
+      <w:proofErr w:type="spellStart"/>
+      <w:r>
+        <w:rPr>
+          <w:color w:val="000000"/>
+          <w:sz w:val="22"/>
+          <w:szCs w:val="22"/>
+          <w:lang w:val="en-150" w:eastAsia="en-150"/>
+        </w:rPr>
+        <w:t>выдачи</w:t>
+      </w:r>
+      <w:proofErr w:type="spellEnd"/>
+      <w:r>
+        <w:rPr>
+          <w:color w:val="000000"/>
+          <w:sz w:val="22"/>
+          <w:szCs w:val="22"/>
+          <w:lang w:val="en-150" w:eastAsia="en-150"/>
+        </w:rPr>
+        <w:t xml:space="preserve"> </w:t>
+      </w:r>
+      <w:proofErr w:type="spellStart"/>
+      <w:r>
+        <w:rPr>
+          <w:color w:val="000000"/>
+          <w:sz w:val="22"/>
+          <w:szCs w:val="22"/>
+          <w:lang w:val="en-150" w:eastAsia="en-150"/>
+        </w:rPr>
+        <w:t>задания</w:t>
+      </w:r>
+      <w:proofErr w:type="spellEnd"/>
+      <w:r>
+        <w:rPr>
+          <w:color w:val="000000"/>
+          <w:sz w:val="22"/>
+          <w:szCs w:val="22"/>
+          <w:lang w:val="en-150" w:eastAsia="en-150"/>
+        </w:rPr>
+        <w:t xml:space="preserve"> «___» ___ 2026 </w:t>
+      </w:r>
+      <w:proofErr w:type="spellStart"/>
+      <w:r>
+        <w:rPr>
+          <w:color w:val="000000"/>
+          <w:sz w:val="22"/>
+          <w:szCs w:val="22"/>
+          <w:lang w:val="en-150" w:eastAsia="en-150"/>
+        </w:rPr>
+        <w:t>года</w:t>
+      </w:r>
+      <w:proofErr w:type="spellEnd"/>
     </w:p>
     <w:p>
       <w:pPr>
@@ -1582,15 +4050,97 @@
           <w:lang w:val="en-150" w:eastAsia="en-150"/>
         </w:rPr>
       </w:pPr>
-      <w:r>
-        <w:rPr>
-          <w:color w:val="000000"/>
-          <w:sz w:val="22"/>
-          <w:szCs w:val="22"/>
-          <w:lang w:val="en-150" w:eastAsia="en-150"/>
-        </w:rPr>
-        <w:t>Дата сдачи выполненного проекта «___» _______ 2026 года</w:t>
-      </w:r>
+      <w:proofErr w:type="spellStart"/>
+      <w:r>
+        <w:rPr>
+          <w:color w:val="000000"/>
+          <w:sz w:val="22"/>
+          <w:szCs w:val="22"/>
+          <w:lang w:val="en-150" w:eastAsia="en-150"/>
+        </w:rPr>
+        <w:t>Дата</w:t>
+      </w:r>
+      <w:proofErr w:type="spellEnd"/>
+      <w:r>
+        <w:rPr>
+          <w:color w:val="000000"/>
+          <w:sz w:val="22"/>
+          <w:szCs w:val="22"/>
+          <w:lang w:val="en-150" w:eastAsia="en-150"/>
+        </w:rPr>
+        <w:t xml:space="preserve"> </w:t>
+      </w:r>
+      <w:proofErr w:type="spellStart"/>
+      <w:r>
+        <w:rPr>
+          <w:color w:val="000000"/>
+          <w:sz w:val="22"/>
+          <w:szCs w:val="22"/>
+          <w:lang w:val="en-150" w:eastAsia="en-150"/>
+        </w:rPr>
+        <w:t>сдачи</w:t>
+      </w:r>
+      <w:proofErr w:type="spellEnd"/>
+      <w:r>
+        <w:rPr>
+          <w:color w:val="000000"/>
+          <w:sz w:val="22"/>
+          <w:szCs w:val="22"/>
+          <w:lang w:val="en-150" w:eastAsia="en-150"/>
+        </w:rPr>
+        <w:t xml:space="preserve"> </w:t>
+      </w:r>
+      <w:proofErr w:type="spellStart"/>
+      <w:r>
+        <w:rPr>
+          <w:color w:val="000000"/>
+          <w:sz w:val="22"/>
+          <w:szCs w:val="22"/>
+          <w:lang w:val="en-150" w:eastAsia="en-150"/>
+        </w:rPr>
+        <w:t>выполненного</w:t>
+      </w:r>
+      <w:proofErr w:type="spellEnd"/>
+      <w:r>
+        <w:rPr>
+          <w:color w:val="000000"/>
+          <w:sz w:val="22"/>
+          <w:szCs w:val="22"/>
+          <w:lang w:val="en-150" w:eastAsia="en-150"/>
+        </w:rPr>
+        <w:t xml:space="preserve"> </w:t>
+      </w:r>
+      <w:proofErr w:type="spellStart"/>
+      <w:r>
+        <w:rPr>
+          <w:color w:val="000000"/>
+          <w:sz w:val="22"/>
+          <w:szCs w:val="22"/>
+          <w:lang w:val="en-150" w:eastAsia="en-150"/>
+        </w:rPr>
+        <w:t>проекта</w:t>
+      </w:r>
+      <w:proofErr w:type="spellEnd"/>
+      <w:r>
+        <w:rPr>
+          <w:color w:val="000000"/>
+          <w:sz w:val="22"/>
+          <w:szCs w:val="22"/>
+          <w:lang w:val="en-150" w:eastAsia="en-150"/>
+        </w:rPr>
+        <w:t xml:space="preserve"> «___» _______ 2026 </w:t>
+      </w:r>
+      <w:proofErr w:type="spellStart"/>
+      <w:r>
+        <w:rPr>
+          <w:color w:val="000000"/>
+          <w:sz w:val="22"/>
+          <w:szCs w:val="22"/>
+          <w:lang w:val="en-150" w:eastAsia="en-150"/>
+        </w:rPr>
+        <w:t>года</w:t>
+      </w:r>
+      <w:proofErr w:type="spellEnd"/>
     </w:p>
     <w:p>
       <w:pPr>
@@ -1604,14 +4154,45 @@
           <w:lang w:val="en-150" w:eastAsia="en-150"/>
         </w:rPr>
       </w:pPr>
-      <w:r>
-        <w:rPr>
-          <w:color w:val="000000"/>
-          <w:sz w:val="22"/>
-          <w:szCs w:val="22"/>
-          <w:lang w:val="en-150" w:eastAsia="en-150"/>
-        </w:rPr>
-        <w:t>Руководитель КП ________________________________________ / Кошкин В.А. /</w:t>
+      <w:proofErr w:type="spellStart"/>
+      <w:r>
+        <w:rPr>
+          <w:color w:val="000000"/>
+          <w:sz w:val="22"/>
+          <w:szCs w:val="22"/>
+          <w:lang w:val="en-150" w:eastAsia="en-150"/>
+        </w:rPr>
+        <w:t>Руководитель</w:t>
+      </w:r>
+      <w:proofErr w:type="spellEnd"/>
+      <w:r>
+        <w:rPr>
+          <w:color w:val="000000"/>
+          <w:sz w:val="22"/>
+          <w:szCs w:val="22"/>
+          <w:lang w:val="en-150" w:eastAsia="en-150"/>
+        </w:rPr>
+        <w:t xml:space="preserve"> КП ________________________________________ / </w:t>
+      </w:r>
+      <w:proofErr w:type="spellStart"/>
+      <w:r>
+        <w:rPr>
+          <w:color w:val="000000"/>
+          <w:sz w:val="22"/>
+          <w:szCs w:val="22"/>
+          <w:lang w:val="en-150" w:eastAsia="en-150"/>
+        </w:rPr>
+        <w:t>Кошкин</w:t>
+      </w:r>
+      <w:proofErr w:type="spellEnd"/>
+      <w:r>
+        <w:rPr>
+          <w:color w:val="000000"/>
+          <w:sz w:val="22"/>
+          <w:szCs w:val="22"/>
+          <w:lang w:val="en-150" w:eastAsia="en-150"/>
+        </w:rPr>
+        <w:t xml:space="preserve"> В.А. /</w:t>
       </w:r>
     </w:p>
     <w:p>
@@ -1626,14 +4207,65 @@
           <w:lang w:val="en-150" w:eastAsia="en-150"/>
         </w:rPr>
       </w:pPr>
-      <w:r>
-        <w:rPr>
-          <w:color w:val="000000"/>
-          <w:sz w:val="22"/>
-          <w:szCs w:val="22"/>
-          <w:lang w:val="en-150" w:eastAsia="en-150"/>
-        </w:rPr>
-        <w:t>Подпись студента ________________________________________ / Кот А.И. /</w:t>
+      <w:proofErr w:type="spellStart"/>
+      <w:r>
+        <w:rPr>
+          <w:color w:val="000000"/>
+          <w:sz w:val="22"/>
+          <w:szCs w:val="22"/>
+          <w:lang w:val="en-150" w:eastAsia="en-150"/>
+        </w:rPr>
+        <w:t>Подпись</w:t>
+      </w:r>
+      <w:proofErr w:type="spellEnd"/>
+      <w:r>
+        <w:rPr>
+          <w:color w:val="000000"/>
+          <w:sz w:val="22"/>
+          <w:szCs w:val="22"/>
+          <w:lang w:val="en-150" w:eastAsia="en-150"/>
+        </w:rPr>
+        <w:t xml:space="preserve"> </w:t>
+      </w:r>
+      <w:proofErr w:type="spellStart"/>
+      <w:r>
+        <w:rPr>
+          <w:color w:val="000000"/>
+          <w:sz w:val="22"/>
+          <w:szCs w:val="22"/>
+          <w:lang w:val="en-150" w:eastAsia="en-150"/>
+        </w:rPr>
+        <w:t>студента</w:t>
+      </w:r>
+      <w:proofErr w:type="spellEnd"/>
+      <w:r>
+        <w:rPr>
+          <w:color w:val="000000"/>
+          <w:sz w:val="22"/>
+          <w:szCs w:val="22"/>
+          <w:lang w:val="en-150" w:eastAsia="en-150"/>
+        </w:rPr>
+        <w:t xml:space="preserve"> ________________________________________ / </w:t>
+      </w:r>
+      <w:proofErr w:type="spellStart"/>
+      <w:r>
+        <w:rPr>
+          <w:color w:val="000000"/>
+          <w:sz w:val="22"/>
+          <w:szCs w:val="22"/>
+          <w:lang w:val="en-150" w:eastAsia="en-150"/>
+        </w:rPr>
+        <w:t>Кот</w:t>
+      </w:r>
+      <w:proofErr w:type="spellEnd"/>
+      <w:r>
+        <w:rPr>
+          <w:color w:val="000000"/>
+          <w:sz w:val="22"/>
+          <w:szCs w:val="22"/>
+          <w:lang w:val="en-150" w:eastAsia="en-150"/>
+        </w:rPr>
+        <w:t xml:space="preserve"> А.И. /</w:t>
       </w:r>
     </w:p>
     <w:p>
@@ -2873,7 +5505,15 @@
         <w:pStyle w:val="affd"/>
       </w:pPr>
       <w:r>
-        <w:t>Целью данного курсового проекта является проектирование базы данных и разработка серверного REST API для системы «CollegeHub». Данная платформа призвана автоматизировать учет посещаемости с помощью технологии QR-кодов, что позволяет минимизировать человеческий фактор и ускорить процесс ведения отчетности.</w:t>
+        <w:t>Целью данного курсового проекта является проектирование базы данных и разработка серверного REST API для системы «</w:t>
+      </w:r>
+      <w:proofErr w:type="spellStart"/>
+      <w:r>
+        <w:t>CollegeHub</w:t>
+      </w:r>
+      <w:proofErr w:type="spellEnd"/>
+      <w:r>
+        <w:t>». Данная платформа призвана автоматизировать учет посещаемости с помощью технологии QR-кодов, что позволяет минимизировать человеческий фактор и ускорить процесс ведения отчетности.</w:t>
       </w:r>
     </w:p>
     <w:p>
@@ -3069,7 +5709,15 @@
         <w:t xml:space="preserve"> изображенная на рисунке 1</w:t>
       </w:r>
       <w:r>
-        <w:t xml:space="preserve"> описывает варианты использования системы основными акторами.</w:t>
+        <w:t xml:space="preserve"> описывает варианты использования системы основными </w:t>
+      </w:r>
+      <w:proofErr w:type="spellStart"/>
+      <w:r>
+        <w:t>акторами</w:t>
+      </w:r>
+      <w:proofErr w:type="spellEnd"/>
+      <w:r>
+        <w:t>.</w:t>
       </w:r>
     </w:p>
     <w:p>
@@ -3132,7 +5780,15 @@
         <w:pStyle w:val="affb"/>
       </w:pPr>
       <w:r>
-        <w:t>Рисунок 1 — Диаграмма вариантов использования (Use Case)</w:t>
+        <w:t>Рисунок 1 — Диаграмма вариантов использования (</w:t>
+      </w:r>
+      <w:proofErr w:type="spellStart"/>
+      <w:r>
+        <w:t>Use</w:t>
+      </w:r>
+      <w:proofErr w:type="spellEnd"/>
+      <w:r>
+        <w:t xml:space="preserve"> Case)</w:t>
       </w:r>
     </w:p>
     <w:p>
@@ -3167,9 +5823,9 @@
       </w:pPr>
       <w:r>
         <w:drawing>
-          <wp:inline distT="0" distB="0" distL="0" distR="0" wp14:anchorId="7FD39777" wp14:editId="3115E82E">
-            <wp:extent cx="5762625" cy="4178300"/>
-            <wp:effectExtent l="0" t="0" r="9525" b="0"/>
+          <wp:inline distT="0" distB="0" distL="0" distR="0" wp14:anchorId="7FD39777" wp14:editId="089856A2">
+            <wp:extent cx="6075375" cy="4752753"/>
+            <wp:effectExtent l="0" t="0" r="1905" b="0"/>
             <wp:docPr id="59" name="Рисунок 59"/>
             <wp:cNvGraphicFramePr>
               <a:graphicFrameLocks xmlns:a="http://schemas.openxmlformats.org/drawingml/2006/main" noChangeAspect="1"/>
@@ -3178,13 +5834,248 @@
               <a:graphicData uri="http://schemas.openxmlformats.org/drawingml/2006/picture">
                 <pic:pic xmlns:pic="http://schemas.openxmlformats.org/drawingml/2006/picture">
                   <pic:nvPicPr>
-                    <pic:cNvPr id="0" name="Picture 3"/>
+                    <pic:cNvPr id="59" name="Рисунок 59"/>
                     <pic:cNvPicPr>
                       <a:picLocks noChangeAspect="1" noChangeArrowheads="1"/>
                     </pic:cNvPicPr>
                   </pic:nvPicPr>
                   <pic:blipFill>
-                    <a:blip r:embed="rId13">
+                    <a:blip r:embed="rId13" cstate="print">
+                      <a:extLst>
+                        <a:ext uri="{28A0092B-C50C-407E-A947-70E740481C1C}">
+                          <a14:useLocalDpi xmlns:a14="http://schemas.microsoft.com/office/drawing/2010/main" val="0"/>
+                        </a:ext>
+                      </a:extLst>
+                    </a:blip>
+                    <a:stretch>
+                      <a:fillRect/>
+                    </a:stretch>
+                  </pic:blipFill>
+                  <pic:spPr bwMode="auto">
+                    <a:xfrm>
+                      <a:off x="0" y="0"/>
+                      <a:ext cx="6080813" cy="4757007"/>
+                    </a:xfrm>
+                    <a:prstGeom prst="rect">
+                      <a:avLst/>
+                    </a:prstGeom>
+                    <a:noFill/>
+                    <a:ln>
+                      <a:noFill/>
+                    </a:ln>
+                  </pic:spPr>
+                </pic:pic>
+              </a:graphicData>
+            </a:graphic>
+          </wp:inline>
+        </w:drawing>
+      </w:r>
+    </w:p>
+    <w:p>
+      <w:pPr>
+        <w:pStyle w:val="affb"/>
+      </w:pPr>
+      <w:r>
+        <w:t xml:space="preserve">Рисунок 2 — Диаграмма </w:t>
+      </w:r>
+      <w:r>
+        <w:t>последовательности</w:t>
+      </w:r>
+      <w:r>
+        <w:t xml:space="preserve"> (</w:t>
+      </w:r>
+      <w:proofErr w:type="spellStart"/>
+      <w:r>
+        <w:t>Sequence</w:t>
+      </w:r>
+      <w:proofErr w:type="spellEnd"/>
+      <w:r>
+        <w:t>)</w:t>
+      </w:r>
+    </w:p>
+    <w:p>
+      <w:pPr>
+        <w:pStyle w:val="affd"/>
+      </w:pPr>
+      <w:r>
+        <w:t>Диаграмма последовательности наглядно показывает путь запроса: от ввода данных QR-кода в мобильном или десктопном приложении до верификации сессии сервером и записи финального статуса в таблицу посещаемости.</w:t>
+      </w:r>
+    </w:p>
+    <w:p>
+      <w:pPr>
+        <w:pStyle w:val="3"/>
+      </w:pPr>
+      <w:r>
+        <w:t>Разработка макета приложения</w:t>
+      </w:r>
+    </w:p>
+    <w:p>
+      <w:pPr>
+        <w:pStyle w:val="affd"/>
+      </w:pPr>
+      <w:r>
+        <w:t xml:space="preserve">Для демонстрации работы разработанного REST API спроектирован интерфейс клиентского приложения на базе WPF. Основной акцент сделан </w:t>
+      </w:r>
+      <w:r>
+        <w:lastRenderedPageBreak/>
+        <w:t>на простоте и доступности интерфейса.</w:t>
+      </w:r>
+      <w:r>
+        <w:t xml:space="preserve"> </w:t>
+      </w:r>
+      <w:r>
+        <w:t>Интерфейс приложения продемонстрирован на рисунке 3.</w:t>
+      </w:r>
+    </w:p>
+    <w:p>
+      <w:pPr>
+        <w:pStyle w:val="affd"/>
+      </w:pPr>
+      <w:r>
+        <w:t>[ВСТАВИТЬ РИСУНОК]</w:t>
+      </w:r>
+    </w:p>
+    <w:p>
+      <w:pPr>
+        <w:pStyle w:val="affb"/>
+      </w:pPr>
+      <w:r>
+        <w:t>Рисунок 3 — Макет окна авторизации</w:t>
+      </w:r>
+    </w:p>
+    <w:p>
+      <w:pPr>
+        <w:pStyle w:val="affd"/>
+      </w:pPr>
+      <w:r>
+        <w:t>Окно авторизации обеспечивает безопасный вход в систему. После успешной проверки учетных данных сервер возвращает JWT-токен, который используется для всех последующих операций.</w:t>
+      </w:r>
+    </w:p>
+    <w:p>
+      <w:pPr>
+        <w:pStyle w:val="affd"/>
+        <w:rPr>
+          <w:lang w:val="en-US"/>
+        </w:rPr>
+      </w:pPr>
+      <w:r>
+        <w:t>Вторым ключевым элементом интерфейса является панель администратора, где сосредоточены инструменты управления образовательным процессом.</w:t>
+      </w:r>
+      <w:r>
+        <w:t xml:space="preserve"> </w:t>
+      </w:r>
+      <w:r>
+        <w:t>Макет панели изображен на рисунке 4, представленным ниже</w:t>
+      </w:r>
+      <w:r>
+        <w:rPr>
+          <w:lang w:val="en-US"/>
+        </w:rPr>
+        <w:t>.</w:t>
+      </w:r>
+    </w:p>
+    <w:p>
+      <w:pPr>
+        <w:pStyle w:val="affd"/>
+      </w:pPr>
+      <w:r>
+        <w:t>[ВСТАВИТЬ РИСУНОК]</w:t>
+      </w:r>
+    </w:p>
+    <w:p>
+      <w:pPr>
+        <w:pStyle w:val="affb"/>
+      </w:pPr>
+      <w:r>
+        <w:t>Рисунок 4 — Макет панели управления администратора</w:t>
+      </w:r>
+    </w:p>
+    <w:p>
+      <w:pPr>
+        <w:pStyle w:val="affd"/>
+      </w:pPr>
+      <w:r>
+        <w:t>В данном окне реализована навигация по разделам управления группами, студентами и расписанием, а также зона генерации активных QR-кодов для текущих лекций и практических занятий.</w:t>
+      </w:r>
+    </w:p>
+    <w:p>
+      <w:pPr>
+        <w:pStyle w:val="2"/>
+      </w:pPr>
+      <w:r>
+        <w:lastRenderedPageBreak/>
+        <w:t xml:space="preserve">Проектирование и разработка базы </w:t>
+      </w:r>
+      <w:proofErr w:type="spellStart"/>
+      <w:r>
+        <w:t>данны</w:t>
+      </w:r>
+      <w:proofErr w:type="spellEnd"/>
+    </w:p>
+    <w:p>
+      <w:pPr>
+        <w:pStyle w:val="3"/>
+      </w:pPr>
+      <w:r>
+        <w:t>Разработка ER-диаграммы на основе сырых данных</w:t>
+      </w:r>
+    </w:p>
+    <w:p>
+      <w:pPr>
+        <w:pStyle w:val="affd"/>
+        <w:rPr>
+          <w:lang w:val="en-US"/>
+        </w:rPr>
+      </w:pPr>
+      <w:r>
+        <w:t>На этапе проектирования структуры хранения данных была разработана диаграмма сущность-связь (ER-диаграмма). Она определяет логическую архитектуру будущей базы данных и связи между основными таблицами.</w:t>
+      </w:r>
+      <w:r>
+        <w:t xml:space="preserve"> </w:t>
+      </w:r>
+      <w:r>
+        <w:t xml:space="preserve">На рисунке 5 отображена </w:t>
+      </w:r>
+      <w:r>
+        <w:rPr>
+          <w:lang w:val="en-US"/>
+        </w:rPr>
+        <w:t>ER</w:t>
+      </w:r>
+      <w:r>
+        <w:t>-диаграмма базы данных проекта</w:t>
+      </w:r>
+      <w:r>
+        <w:rPr>
+          <w:lang w:val="en-US"/>
+        </w:rPr>
+        <w:t>.</w:t>
+      </w:r>
+    </w:p>
+    <w:p>
+      <w:pPr>
+        <w:pStyle w:val="afff1"/>
+      </w:pPr>
+      <w:r>
+        <w:drawing>
+          <wp:inline distT="0" distB="0" distL="0" distR="0" wp14:anchorId="1D4FA08C" wp14:editId="67FD9F66">
+            <wp:extent cx="5762625" cy="4178300"/>
+            <wp:effectExtent l="0" t="0" r="9525" b="0"/>
+            <wp:docPr id="60" name="Рисунок 60"/>
+            <wp:cNvGraphicFramePr>
+              <a:graphicFrameLocks xmlns:a="http://schemas.openxmlformats.org/drawingml/2006/main" noChangeAspect="1"/>
+            </wp:cNvGraphicFramePr>
+            <a:graphic xmlns:a="http://schemas.openxmlformats.org/drawingml/2006/main">
+              <a:graphicData uri="http://schemas.openxmlformats.org/drawingml/2006/picture">
+                <pic:pic xmlns:pic="http://schemas.openxmlformats.org/drawingml/2006/picture">
+                  <pic:nvPicPr>
+                    <pic:cNvPr id="0" name="Picture 4"/>
+                    <pic:cNvPicPr>
+                      <a:picLocks noChangeAspect="1" noChangeArrowheads="1"/>
+                    </pic:cNvPicPr>
+                  </pic:nvPicPr>
+                  <pic:blipFill>
+                    <a:blip r:embed="rId14">
                       <a:extLst>
                         <a:ext uri="{28A0092B-C50C-407E-A947-70E740481C1C}">
                           <a14:useLocalDpi xmlns:a14="http://schemas.microsoft.com/office/drawing/2010/main" val="0"/>
@@ -3221,15 +6112,52 @@
         <w:pStyle w:val="affb"/>
       </w:pPr>
       <w:r>
-        <w:t>Рисунок 2 — Диаграмма последовательности (Sequence)</w:t>
-      </w:r>
+        <w:t xml:space="preserve">Рисунок 5 — ER-диаграмма базы данных </w:t>
+      </w:r>
+      <w:proofErr w:type="spellStart"/>
+      <w:r>
+        <w:t>CollegeHub</w:t>
+      </w:r>
+      <w:proofErr w:type="spellEnd"/>
     </w:p>
     <w:p>
       <w:pPr>
         <w:pStyle w:val="affd"/>
       </w:pPr>
       <w:r>
-        <w:t>Диаграмма последовательности наглядно показывает путь запроса: от ввода данных QR-кода в мобильном или десктопном приложении до верификации сессии сервером и записи финального статуса в таблицу посещаемости.</w:t>
+        <w:t>Основные сущности включают:</w:t>
+      </w:r>
+    </w:p>
+    <w:p>
+      <w:pPr>
+        <w:pStyle w:val="affd"/>
+      </w:pPr>
+      <w:r>
+        <w:t>- Пользователи и роли (реализуют систему доступа);</w:t>
+      </w:r>
+    </w:p>
+    <w:p>
+      <w:pPr>
+        <w:pStyle w:val="affd"/>
+      </w:pPr>
+      <w:r>
+        <w:t>- Группы и предметы (описывают академическую структуру);</w:t>
+      </w:r>
+    </w:p>
+    <w:p>
+      <w:pPr>
+        <w:pStyle w:val="affd"/>
+      </w:pPr>
+      <w:r>
+        <w:t>- Расписание (связующее звено между временем, местом и участниками);</w:t>
+      </w:r>
+    </w:p>
+    <w:p>
+      <w:pPr>
+        <w:pStyle w:val="affd"/>
+      </w:pPr>
+      <w:r>
+        <w:t>- QR-сессии и посещаемость (инструменты фиксации присутствия).</w:t>
       </w:r>
     </w:p>
     <w:p>
@@ -3237,7 +6165,8 @@
         <w:pStyle w:val="3"/>
       </w:pPr>
       <w:r>
-        <w:t>Разработка макета приложения</w:t>
+        <w:lastRenderedPageBreak/>
+        <w:t>Разработка физической модели базы данных в MS SQL Server</w:t>
       </w:r>
     </w:p>
     <w:p>
@@ -3245,7 +6174,7 @@
         <w:pStyle w:val="affd"/>
       </w:pPr>
       <w:r>
-        <w:t>Для демонстрации работы разработанного REST API спроектирован интерфейс клиентского приложения на базе WPF. Основной акцент сделан на простоте и доступности интерфейса.</w:t>
+        <w:t>Физическая модель данных реализована в среде MS SQL Server. При проектировании были использованы современные типы данных, обеспечивающие оптимальное хранение информации. Для хранения паролей предусмотрено поле длинного текстового формата для записи хешированных значений, что повышает безопасность системы.</w:t>
       </w:r>
     </w:p>
     <w:p>
@@ -3253,6 +6182,379 @@
         <w:pStyle w:val="affd"/>
       </w:pPr>
       <w:r>
+        <w:t xml:space="preserve">Архитектура системы построена на принципах нормализации, что исключает избыточность данных. Каждая таблица имеет первичный ключ, а связи реализованы через внешние ключи. Для ускорения поиска по часто запрашиваемым полям, таким как электронная почта или идентификатор группы, предусмотрено создание </w:t>
+      </w:r>
+      <w:proofErr w:type="spellStart"/>
+      <w:r>
+        <w:t>некластерных</w:t>
+      </w:r>
+      <w:proofErr w:type="spellEnd"/>
+      <w:r>
+        <w:t xml:space="preserve"> индексов.</w:t>
+      </w:r>
+    </w:p>
+    <w:p>
+      <w:pPr>
+        <w:pStyle w:val="3"/>
+      </w:pPr>
+      <w:r>
+        <w:t>Разработка и именование связей и ограничений</w:t>
+      </w:r>
+    </w:p>
+    <w:p>
+      <w:pPr>
+        <w:pStyle w:val="affd"/>
+      </w:pPr>
+      <w:r>
+        <w:t>Для обеспечения целостности данных в базе реализована система ограничений и правил каскадного обновления:</w:t>
+      </w:r>
+    </w:p>
+    <w:p>
+      <w:pPr>
+        <w:pStyle w:val="affd"/>
+      </w:pPr>
+      <w:r>
+        <w:t>- Ограничения первичных и внешних ключей (PRIMARY KEY, FOREIGN KEY) предотвращают появление записей-сирот;</w:t>
+      </w:r>
+    </w:p>
+    <w:p>
+      <w:pPr>
+        <w:pStyle w:val="affd"/>
+      </w:pPr>
+      <w:r>
+        <w:t>- Проверочные ограничения (CHECK) контролируют корректность вводимых данных, например, диапазон курсов обучения (от 1 до 4) или формат времени занятий;</w:t>
+      </w:r>
+    </w:p>
+    <w:p>
+      <w:pPr>
+        <w:pStyle w:val="affd"/>
+      </w:pPr>
+      <w:r>
+        <w:t>- Каскадные операции (ON DELETE CASCADE) используются в таблицах расписания и посещаемости для автоматической очистки данных при удалении связанных объектов;</w:t>
+      </w:r>
+    </w:p>
+    <w:p>
+      <w:pPr>
+        <w:pStyle w:val="affd"/>
+      </w:pPr>
+      <w:r>
+        <w:t>- Уникальные индексы (UNIQUE) гарантируют отсутствие дубликатов в критически важных полях, таких как почта пользователя или данные QR-сессии.</w:t>
+      </w:r>
+    </w:p>
+    <w:p>
+      <w:pPr>
+        <w:pStyle w:val="aff9"/>
+      </w:pPr>
+      <w:r>
+        <w:t>Таблица 2 — Описание основных связей таблиц</w:t>
+      </w:r>
+    </w:p>
+    <w:tbl>
+      <w:tblPr>
+        <w:tblStyle w:val="aff"/>
+        <w:tblW w:w="0" w:type="auto"/>
+        <w:tblInd w:w="57" w:type="dxa"/>
+        <w:tblLook w:val="04A0" w:firstRow="1" w:lastRow="0" w:firstColumn="1" w:lastColumn="0" w:noHBand="0" w:noVBand="1"/>
+      </w:tblPr>
+      <w:tblGrid>
+        <w:gridCol w:w="3340"/>
+        <w:gridCol w:w="2662"/>
+        <w:gridCol w:w="3002"/>
+      </w:tblGrid>
+      <w:tr>
+        <w:tc>
+          <w:tcPr>
+            <w:tcW w:w="3340" w:type="dxa"/>
+          </w:tcPr>
+          <w:p>
+            <w:r>
+              <w:lastRenderedPageBreak/>
+              <w:t>Связанные таблицы</w:t>
+            </w:r>
+          </w:p>
+        </w:tc>
+        <w:tc>
+          <w:tcPr>
+            <w:tcW w:w="2662" w:type="dxa"/>
+          </w:tcPr>
+          <w:p>
+            <w:r>
+              <w:t>Тип связи</w:t>
+            </w:r>
+          </w:p>
+        </w:tc>
+        <w:tc>
+          <w:tcPr>
+            <w:tcW w:w="3002" w:type="dxa"/>
+          </w:tcPr>
+          <w:p>
+            <w:r>
+              <w:t>Правило удаления</w:t>
+            </w:r>
+          </w:p>
+        </w:tc>
+      </w:tr>
+      <w:tr>
+        <w:tc>
+          <w:tcPr>
+            <w:tcW w:w="3340" w:type="dxa"/>
+            <w:vAlign w:val="center"/>
+          </w:tcPr>
+          <w:p>
+            <w:pPr>
+              <w:jc w:val="left"/>
+            </w:pPr>
+            <w:r>
+              <w:t>Роли — Пользователи</w:t>
+            </w:r>
+          </w:p>
+        </w:tc>
+        <w:tc>
+          <w:tcPr>
+            <w:tcW w:w="2662" w:type="dxa"/>
+            <w:vAlign w:val="center"/>
+          </w:tcPr>
+          <w:p>
+            <w:pPr>
+              <w:jc w:val="left"/>
+            </w:pPr>
+            <w:r>
+              <w:t>Один ко многим</w:t>
+            </w:r>
+          </w:p>
+        </w:tc>
+        <w:tc>
+          <w:tcPr>
+            <w:tcW w:w="3002" w:type="dxa"/>
+            <w:vAlign w:val="center"/>
+          </w:tcPr>
+          <w:p>
+            <w:pPr>
+              <w:jc w:val="left"/>
+            </w:pPr>
+            <w:r>
+              <w:t>Запрет удаления</w:t>
+            </w:r>
+          </w:p>
+        </w:tc>
+      </w:tr>
+      <w:tr>
+        <w:tc>
+          <w:tcPr>
+            <w:tcW w:w="3340" w:type="dxa"/>
+            <w:vAlign w:val="center"/>
+          </w:tcPr>
+          <w:p>
+            <w:pPr>
+              <w:jc w:val="left"/>
+            </w:pPr>
+            <w:r>
+              <w:t>Группы — Пользователи</w:t>
+            </w:r>
+          </w:p>
+        </w:tc>
+        <w:tc>
+          <w:tcPr>
+            <w:tcW w:w="2662" w:type="dxa"/>
+            <w:vAlign w:val="center"/>
+          </w:tcPr>
+          <w:p>
+            <w:pPr>
+              <w:jc w:val="left"/>
+            </w:pPr>
+            <w:r>
+              <w:t>Один ко многим</w:t>
+            </w:r>
+          </w:p>
+        </w:tc>
+        <w:tc>
+          <w:tcPr>
+            <w:tcW w:w="3002" w:type="dxa"/>
+            <w:vAlign w:val="center"/>
+          </w:tcPr>
+          <w:p>
+            <w:pPr>
+              <w:jc w:val="left"/>
+            </w:pPr>
+            <w:r>
+              <w:t>Установка NULL</w:t>
+            </w:r>
+          </w:p>
+        </w:tc>
+      </w:tr>
+      <w:tr>
+        <w:tc>
+          <w:tcPr>
+            <w:tcW w:w="3340" w:type="dxa"/>
+            <w:vAlign w:val="center"/>
+          </w:tcPr>
+          <w:p>
+            <w:pPr>
+              <w:jc w:val="left"/>
+            </w:pPr>
+            <w:r>
+              <w:t>Расписание — Посещаемость</w:t>
+            </w:r>
+          </w:p>
+        </w:tc>
+        <w:tc>
+          <w:tcPr>
+            <w:tcW w:w="2662" w:type="dxa"/>
+            <w:vAlign w:val="center"/>
+          </w:tcPr>
+          <w:p>
+            <w:pPr>
+              <w:jc w:val="left"/>
+            </w:pPr>
+            <w:r>
+              <w:t>Один ко многим</w:t>
+            </w:r>
+          </w:p>
+        </w:tc>
+        <w:tc>
+          <w:tcPr>
+            <w:tcW w:w="3002" w:type="dxa"/>
+            <w:vAlign w:val="center"/>
+          </w:tcPr>
+          <w:p>
+            <w:pPr>
+              <w:jc w:val="left"/>
+            </w:pPr>
+            <w:r>
+              <w:t>Каскадное удаление</w:t>
+            </w:r>
+          </w:p>
+        </w:tc>
+      </w:tr>
+    </w:tbl>
+    <w:p>
+      <w:pPr>
+        <w:pStyle w:val="aff9"/>
+      </w:pPr>
+    </w:p>
+    <w:p>
+      <w:pPr>
+        <w:pStyle w:val="2"/>
+      </w:pPr>
+      <w:r>
+        <w:lastRenderedPageBreak/>
+        <w:t>Проектирование и разработка приложения</w:t>
+      </w:r>
+    </w:p>
+    <w:p>
+      <w:pPr>
+        <w:pStyle w:val="3"/>
+      </w:pPr>
+      <w:r>
+        <w:t>Разработка прототипа приложения</w:t>
+      </w:r>
+    </w:p>
+    <w:p>
+      <w:pPr>
+        <w:pStyle w:val="affd"/>
+      </w:pPr>
+      <w:r>
+        <w:t xml:space="preserve">Программный комплекс </w:t>
+      </w:r>
+      <w:proofErr w:type="spellStart"/>
+      <w:r>
+        <w:t>CollegeHub</w:t>
+      </w:r>
+      <w:proofErr w:type="spellEnd"/>
+      <w:r>
+        <w:t xml:space="preserve"> состоит из серверной части и клиентского демонстратора. Серверная часть разработана с использованием фреймворка </w:t>
+      </w:r>
+      <w:proofErr w:type="spellStart"/>
+      <w:r>
+        <w:t>FastAPI</w:t>
+      </w:r>
+      <w:proofErr w:type="spellEnd"/>
+      <w:r>
+        <w:t xml:space="preserve"> на языке Python. Выбор данной технологии обоснован высокой производительностью и встроенной поддержкой асинхронности.</w:t>
+      </w:r>
+    </w:p>
+    <w:p>
+      <w:pPr>
+        <w:pStyle w:val="affd"/>
+      </w:pPr>
+      <w:r>
+        <w:t>Основные характеристики серверной реализации:</w:t>
+      </w:r>
+    </w:p>
+    <w:p>
+      <w:pPr>
+        <w:pStyle w:val="affd"/>
+      </w:pPr>
+      <w:r>
+        <w:t>- Использование стандарта JWT для авторизации запросов;</w:t>
+      </w:r>
+    </w:p>
+    <w:p>
+      <w:pPr>
+        <w:pStyle w:val="affd"/>
+      </w:pPr>
+      <w:r>
+        <w:t xml:space="preserve">- Автоматическая генерация документации через </w:t>
+      </w:r>
+      <w:proofErr w:type="spellStart"/>
+      <w:r>
+        <w:t>Swagger</w:t>
+      </w:r>
+      <w:proofErr w:type="spellEnd"/>
+      <w:r>
+        <w:t xml:space="preserve"> UI;</w:t>
+      </w:r>
+    </w:p>
+    <w:p>
+      <w:pPr>
+        <w:pStyle w:val="affd"/>
+      </w:pPr>
+      <w:r>
+        <w:t>- Реализация логики определения статуса студента (вовремя, опоздал) на основе сравнения текущего времени с расписанием занятия.</w:t>
+      </w:r>
+    </w:p>
+    <w:p>
+      <w:pPr>
+        <w:pStyle w:val="affd"/>
+      </w:pPr>
+      <w:r>
+        <w:t>Клиентское приложение на WPF служит инструментом для демонстрации возможностей API. Оно отправляет HTTP-запросы на сервер, получает данные в формате JSON и визуализирует их в удобном для пользователя виде.</w:t>
+      </w:r>
+    </w:p>
+    <w:p>
+      <w:pPr>
+        <w:pStyle w:val="3"/>
+      </w:pPr>
+      <w:r>
+        <w:t xml:space="preserve">Разработка описания проекта в </w:t>
+      </w:r>
+      <w:proofErr w:type="spellStart"/>
+      <w:r>
+        <w:t>GitHub</w:t>
+      </w:r>
+      <w:proofErr w:type="spellEnd"/>
+    </w:p>
+    <w:p>
+      <w:pPr>
+        <w:pStyle w:val="affd"/>
+      </w:pPr>
+      <w:r>
+        <w:t xml:space="preserve">Для управления версиями и организации совместной работы проект размещен в системе </w:t>
+      </w:r>
+      <w:proofErr w:type="spellStart"/>
+      <w:r>
+        <w:t>GitHub</w:t>
+      </w:r>
+      <w:proofErr w:type="spellEnd"/>
+      <w:r>
+        <w:t>. Структура репозитория организована таким образом, чтобы разделять программный код сервера, базу данных и клиентскую часть.</w:t>
+      </w:r>
+    </w:p>
+    <w:p>
+      <w:pPr>
+        <w:pStyle w:val="affd"/>
+      </w:pPr>
+      <w:r>
         <w:t>[ВСТАВИТЬ РИСУНОК]</w:t>
       </w:r>
     </w:p>
@@ -3261,16 +6563,70 @@
         <w:pStyle w:val="affd"/>
       </w:pPr>
       <w:r>
+        <w:t xml:space="preserve">Рисунок 6 — Структура проекта в репозитории </w:t>
+      </w:r>
+      <w:proofErr w:type="spellStart"/>
+      <w:r>
+        <w:t>GitHub</w:t>
+      </w:r>
+      <w:proofErr w:type="spellEnd"/>
+    </w:p>
+    <w:p>
+      <w:pPr>
+        <w:pStyle w:val="affd"/>
+      </w:pPr>
+      <w:r>
+        <w:t>В корневой папке проекта находится файл конфигурации для контейнеризации, позволяющий развернуть базу данных и API в одну команду.</w:t>
+      </w:r>
+    </w:p>
+    <w:p>
+      <w:pPr>
+        <w:pStyle w:val="affd"/>
+      </w:pPr>
+      <w:r>
+        <w:t>[ВСТАВИТЬ РИСУНОК]</w:t>
+      </w:r>
+    </w:p>
+    <w:p>
+      <w:pPr>
+        <w:pStyle w:val="affd"/>
+      </w:pPr>
+      <w:r>
         <w:lastRenderedPageBreak/>
-        <w:t>Рисунок 3 — Макет окна авторизации</w:t>
-      </w:r>
+        <w:t xml:space="preserve">Рисунок 7 — Описание файла README в </w:t>
+      </w:r>
+      <w:proofErr w:type="spellStart"/>
+      <w:r>
+        <w:t>GitHub</w:t>
+      </w:r>
+      <w:proofErr w:type="spellEnd"/>
     </w:p>
     <w:p>
       <w:pPr>
         <w:pStyle w:val="affd"/>
       </w:pPr>
       <w:r>
-        <w:t>Окно авторизации обеспечивает безопасный вход в систему. После успешной проверки учетных данных сервер возвращает JWT-токен, который используется для всех последующих операций.</w:t>
+        <w:t xml:space="preserve">Файл описания содержит краткую инструкцию по установке зависимостей, запуску системы и документацию по основным </w:t>
+      </w:r>
+      <w:proofErr w:type="spellStart"/>
+      <w:r>
+        <w:t>эндпоинтам</w:t>
+      </w:r>
+      <w:proofErr w:type="spellEnd"/>
+      <w:r>
+        <w:t xml:space="preserve"> API. Это обеспечивает легкий порог вхождения для других разработчиков или проверяющих лиц.</w:t>
+      </w:r>
+      <w:r>
+        <w:br w:type="page"/>
+      </w:r>
+    </w:p>
+    <w:p>
+      <w:pPr>
+        <w:pStyle w:val="ATT-1"/>
+      </w:pPr>
+      <w:r>
+        <w:lastRenderedPageBreak/>
+        <w:t>Заключение</w:t>
       </w:r>
     </w:p>
     <w:p>
@@ -3278,7 +6634,15 @@
         <w:pStyle w:val="affd"/>
       </w:pPr>
       <w:r>
-        <w:t>Вторым ключевым элементом интерфейса является панель администратора, где сосредоточены инструменты управления образовательным процессом.</w:t>
+        <w:t>В результате выполнения курсового проекта была спроектирована и реализована информационная система «</w:t>
+      </w:r>
+      <w:proofErr w:type="spellStart"/>
+      <w:r>
+        <w:t>CollegeHub</w:t>
+      </w:r>
+      <w:proofErr w:type="spellEnd"/>
+      <w:r>
+        <w:t>», предназначенная для автоматизации учета посещаемости в колледже. В ходе работы были решены следующие задачи:</w:t>
       </w:r>
     </w:p>
     <w:p>
@@ -3286,7 +6650,7 @@
         <w:pStyle w:val="affd"/>
       </w:pPr>
       <w:r>
-        <w:t>[ВСТАВИТЬ РИСУНОК]</w:t>
+        <w:t>- Проведен детальный анализ предметной области и выделены ключевые роли пользователей;</w:t>
       </w:r>
     </w:p>
     <w:p>
@@ -3294,7 +6658,7 @@
         <w:pStyle w:val="affd"/>
       </w:pPr>
       <w:r>
-        <w:t>Рисунок 4 — Макет панели управления администратора</w:t>
+        <w:t>- Спроектирована надежная база данных в MS SQL Server с учетом всех правил целостности данных;</w:t>
       </w:r>
     </w:p>
     <w:p>
@@ -3302,7 +6666,7 @@
         <w:pStyle w:val="affd"/>
       </w:pPr>
       <w:r>
-        <w:t>В данном окне реализована навигация по разделам управления группами, студентами и расписанием, а также зона генерации активных QR-кодов для текущих лекций и практических занятий.</w:t>
+        <w:t>- Разработано серверное REST API, обеспечивающее безопасный обмен данными и логику обработки QR-кодов;</w:t>
       </w:r>
     </w:p>
     <w:p>
@@ -3310,7 +6674,7 @@
         <w:pStyle w:val="affd"/>
       </w:pPr>
       <w:r>
-        <w:t>2 Проектирование и разработка базы данны</w:t>
+        <w:t>- Создан клиентский прототип на базе WPF для демонстрации работы системы.</w:t>
       </w:r>
     </w:p>
     <w:p>
@@ -3318,7 +6682,7 @@
         <w:pStyle w:val="affd"/>
       </w:pPr>
       <w:r>
-        <w:t>2.1 Разработка ER-диаграммы на основе сырых данных</w:t>
+        <w:t>Практическая значимость проекта заключается в возможности внедрения данной системы в реальный учебный процесс, что позволит сократить временные затраты на административные задачи и повысить точность сбора статистики посещаемости.</w:t>
       </w:r>
     </w:p>
     <w:p>
@@ -3326,23 +6690,68 @@
         <w:pStyle w:val="affd"/>
       </w:pPr>
       <w:r>
-        <w:t>На этапе проектирования структуры хранения данных была разработана диаграмма сущность-связь (ER-диаграмма). Она определяет логическую архитектуру будущей базы данных и связи между основными таблицами.</w:t>
+        <w:br w:type="page"/>
       </w:r>
     </w:p>
     <w:p>
       <w:pPr>
         <w:pStyle w:val="affd"/>
       </w:pPr>
-      <w:r>
-        <w:t>[ВСТАВИТЬ РИСУНОК]</w:t>
+    </w:p>
+    <w:p>
+      <w:pPr>
+        <w:pStyle w:val="ATT-1"/>
+      </w:pPr>
+      <w:r>
+        <w:t>Литература</w:t>
       </w:r>
     </w:p>
     <w:p>
       <w:pPr>
         <w:pStyle w:val="affd"/>
       </w:pPr>
-      <w:r>
-        <w:t>Рисунок 5 — ER-диаграмма базы данных CollegeHub</w:t>
+      <w:proofErr w:type="spellStart"/>
+      <w:r>
+        <w:rPr>
+          <w:b/>
+          <w:bCs/>
+        </w:rPr>
+        <w:t>Конолли</w:t>
+      </w:r>
+      <w:proofErr w:type="spellEnd"/>
+      <w:r>
+        <w:rPr>
+          <w:b/>
+          <w:bCs/>
+        </w:rPr>
+        <w:t>, Т.</w:t>
+      </w:r>
+      <w:r>
+        <w:t xml:space="preserve"> Базы данных. Проектирование, реализация и сопровождение. Теория и практика / Т. </w:t>
+      </w:r>
+      <w:proofErr w:type="spellStart"/>
+      <w:r>
+        <w:t>Конолли</w:t>
+      </w:r>
+      <w:proofErr w:type="spellEnd"/>
+      <w:r>
+        <w:t xml:space="preserve">, К. </w:t>
+      </w:r>
+      <w:proofErr w:type="spellStart"/>
+      <w:r>
+        <w:t>Бегг</w:t>
+      </w:r>
+      <w:proofErr w:type="spellEnd"/>
+      <w:r>
+        <w:t xml:space="preserve">. — 7-е изд. — </w:t>
+      </w:r>
+      <w:proofErr w:type="gramStart"/>
+      <w:r>
+        <w:t>Москва :</w:t>
+      </w:r>
+      <w:proofErr w:type="gramEnd"/>
+      <w:r>
+        <w:t xml:space="preserve"> Вильямс, 2021. — 1440 c.;</w:t>
       </w:r>
     </w:p>
     <w:p>
@@ -3350,7 +6759,22 @@
         <w:pStyle w:val="affd"/>
       </w:pPr>
       <w:r>
-        <w:t>Основные сущности включают:</w:t>
+        <w:rPr>
+          <w:b/>
+          <w:bCs/>
+        </w:rPr>
+        <w:t xml:space="preserve">Мартин, Р. </w:t>
+      </w:r>
+      <w:r>
+        <w:t>Чистая архитектура. Искусство разработки программного обеспечения / Р. Мартин. — Санкт-</w:t>
+      </w:r>
+      <w:proofErr w:type="gramStart"/>
+      <w:r>
+        <w:t>Петербург :</w:t>
+      </w:r>
+      <w:proofErr w:type="gramEnd"/>
+      <w:r>
+        <w:t xml:space="preserve"> Питер, 2022. — 352 c.;</w:t>
       </w:r>
     </w:p>
     <w:p>
@@ -3358,382 +6782,79 @@
         <w:pStyle w:val="affd"/>
       </w:pPr>
       <w:r>
-        <w:t>- Пользователи и роли (реализуют систему доступа);</w:t>
+        <w:rPr>
+          <w:b/>
+          <w:bCs/>
+        </w:rPr>
+        <w:t>Шварц, Б.</w:t>
+      </w:r>
+      <w:r>
+        <w:t xml:space="preserve"> SQL. Сборник рецептов / Б. Шварц. — Санкт-</w:t>
+      </w:r>
+      <w:proofErr w:type="gramStart"/>
+      <w:r>
+        <w:t>Петербург :</w:t>
+      </w:r>
+      <w:proofErr w:type="gramEnd"/>
+      <w:r>
+        <w:t xml:space="preserve"> Питер, 2023. — 416 c.;</w:t>
       </w:r>
     </w:p>
     <w:p>
       <w:pPr>
         <w:pStyle w:val="affd"/>
-      </w:pPr>
-      <w:r>
-        <w:t>- Группы и предметы (описывают академическую структуру);</w:t>
+        <w:rPr>
+          <w:lang w:val="en-US"/>
+        </w:rPr>
+      </w:pPr>
+      <w:proofErr w:type="spellStart"/>
+      <w:r>
+        <w:rPr>
+          <w:b/>
+          <w:bCs/>
+          <w:lang w:val="en-US"/>
+        </w:rPr>
+        <w:t>FastAPI</w:t>
+      </w:r>
+      <w:proofErr w:type="spellEnd"/>
+      <w:r>
+        <w:rPr>
+          <w:b/>
+          <w:bCs/>
+          <w:lang w:val="en-US"/>
+        </w:rPr>
+        <w:t xml:space="preserve"> Documentation.</w:t>
+      </w:r>
+      <w:r>
+        <w:rPr>
+          <w:lang w:val="en-US"/>
+        </w:rPr>
+        <w:t xml:space="preserve"> — URL: https://fastapi.tiangolo.com (</w:t>
+      </w:r>
+      <w:r>
+        <w:t>дата</w:t>
+      </w:r>
+      <w:r>
+        <w:rPr>
+          <w:lang w:val="en-US"/>
+        </w:rPr>
+        <w:t xml:space="preserve"> </w:t>
+      </w:r>
+      <w:r>
+        <w:t>обращения</w:t>
+      </w:r>
+      <w:r>
+        <w:rPr>
+          <w:lang w:val="en-US"/>
+        </w:rPr>
+        <w:t>: 20.06.2026);</w:t>
       </w:r>
     </w:p>
     <w:p>
       <w:pPr>
         <w:pStyle w:val="affd"/>
-      </w:pPr>
-      <w:r>
-        <w:t>- Расписание (связующее звено между временем, местом и участниками);</w:t>
-      </w:r>
-    </w:p>
-    <w:p>
-      <w:pPr>
-        <w:pStyle w:val="affd"/>
-      </w:pPr>
-      <w:r>
-        <w:t>- QR-сессии и посещаемость (инструменты фиксации присутствия).</w:t>
-      </w:r>
-    </w:p>
-    <w:p>
-      <w:pPr>
-        <w:pStyle w:val="affd"/>
-      </w:pPr>
-      <w:r>
-        <w:t>2.2 Разработка физической модели базы данных в MS SQL Server</w:t>
-      </w:r>
-    </w:p>
-    <w:p>
-      <w:pPr>
-        <w:pStyle w:val="affd"/>
-      </w:pPr>
-      <w:r>
-        <w:t xml:space="preserve">Физическая модель данных реализована в среде MS SQL Server. При проектировании были использованы современные типы данных, </w:t>
-      </w:r>
-      <w:r>
-        <w:lastRenderedPageBreak/>
-        <w:t>обеспечивающие оптимальное хранение информации. Для хранения паролей предусмотрено поле длинного текстового формата для записи хешированных значений, что повышает безопасность системы.</w:t>
-      </w:r>
-    </w:p>
-    <w:p>
-      <w:pPr>
-        <w:pStyle w:val="affd"/>
-      </w:pPr>
-      <w:r>
-        <w:t>Архитектура системы построена на принципах нормализации, что исключает избыточность данных. Каждая таблица имеет первичный ключ, а связи реализованы через внешние ключи. Для ускорения поиска по часто запрашиваемым полям, таким как электронная почта или идентификатор группы, предусмотрено создание некластерных индексов.</w:t>
-      </w:r>
-    </w:p>
-    <w:p>
-      <w:pPr>
-        <w:pStyle w:val="affd"/>
-      </w:pPr>
-      <w:r>
-        <w:t>2.3 Разработка и именование связей и ограничений</w:t>
-      </w:r>
-    </w:p>
-    <w:p>
-      <w:pPr>
-        <w:pStyle w:val="affd"/>
-      </w:pPr>
-      <w:r>
-        <w:t>Для обеспечения целостности данных в базе реализована система ограничений и правил каскадного обновления:</w:t>
-      </w:r>
-    </w:p>
-    <w:p>
-      <w:pPr>
-        <w:pStyle w:val="affd"/>
-      </w:pPr>
-      <w:r>
-        <w:t>- Ограничения первичных и внешних ключей (PRIMARY KEY, FOREIGN KEY) предотвращают появление записей-сирот;</w:t>
-      </w:r>
-    </w:p>
-    <w:p>
-      <w:pPr>
-        <w:pStyle w:val="affd"/>
-      </w:pPr>
-      <w:r>
-        <w:t>- Проверочные ограничения (CHECK) контролируют корректность вводимых данных, например, диапазон курсов обучения (от 1 до 4) или формат времени занятий;</w:t>
-      </w:r>
-    </w:p>
-    <w:p>
-      <w:pPr>
-        <w:pStyle w:val="affd"/>
-      </w:pPr>
-      <w:r>
-        <w:t>- Каскадные операции (ON DELETE CASCADE) используются в таблицах расписания и посещаемости для автоматической очистки данных при удалении связанных объектов;</w:t>
-      </w:r>
-    </w:p>
-    <w:p>
-      <w:pPr>
-        <w:pStyle w:val="affd"/>
-      </w:pPr>
-      <w:r>
-        <w:t>- Уникальные индексы (UNIQUE) гарантируют отсутствие дубликатов в критически важных полях, таких как почта пользователя или данные QR-сессии.</w:t>
-      </w:r>
-    </w:p>
-    <w:p>
-      <w:pPr>
-        <w:pStyle w:val="affd"/>
-      </w:pPr>
-      <w:r>
-        <w:t>Таблица 2 — Описание основных связей таблиц</w:t>
-      </w:r>
-    </w:p>
-    <w:p>
-      <w:pPr>
-        <w:pStyle w:val="affd"/>
-      </w:pPr>
-      <w:r>
-        <w:t>| Связанные таблицы | Тип связи | Правило удаления |</w:t>
-      </w:r>
-    </w:p>
-    <w:p>
-      <w:pPr>
-        <w:pStyle w:val="affd"/>
-      </w:pPr>
-      <w:r>
-        <w:t>| :--- | :--- | :--- |</w:t>
-      </w:r>
-    </w:p>
-    <w:p>
-      <w:pPr>
-        <w:pStyle w:val="affd"/>
-      </w:pPr>
-      <w:r>
-        <w:t>| Роли — Пользователи | Один ко многим | Запрет удаления |</w:t>
-      </w:r>
-    </w:p>
-    <w:p>
-      <w:pPr>
-        <w:pStyle w:val="affd"/>
-      </w:pPr>
-      <w:r>
-        <w:t>| Группы — Пользователи | Один ко многим | Установка NULL |</w:t>
-      </w:r>
-    </w:p>
-    <w:p>
-      <w:pPr>
-        <w:pStyle w:val="affd"/>
-      </w:pPr>
-      <w:r>
-        <w:t>| Расписание — Посещаемость | Один ко многим | Каскадное удаление |</w:t>
-      </w:r>
-    </w:p>
-    <w:p>
-      <w:pPr>
-        <w:pStyle w:val="affd"/>
-      </w:pPr>
-      <w:r>
-        <w:lastRenderedPageBreak/>
-        <w:t>3 Проектирование и разработка приложения</w:t>
-      </w:r>
-    </w:p>
-    <w:p>
-      <w:pPr>
-        <w:pStyle w:val="affd"/>
-      </w:pPr>
-      <w:r>
-        <w:t>3.1 Разработка прототипа приложения</w:t>
-      </w:r>
-    </w:p>
-    <w:p>
-      <w:pPr>
-        <w:pStyle w:val="affd"/>
-      </w:pPr>
-      <w:r>
-        <w:t>Программный комплекс CollegeHub состоит из серверной части и клиентского демонстратора. Серверная часть разработана с использованием фреймворка FastAPI на языке Python. Выбор данной технологии обоснован высокой производительностью и встроенной поддержкой асинхронности.</w:t>
-      </w:r>
-    </w:p>
-    <w:p>
-      <w:pPr>
-        <w:pStyle w:val="affd"/>
-      </w:pPr>
-      <w:r>
-        <w:t>Основные характеристики серверной реализации:</w:t>
-      </w:r>
-    </w:p>
-    <w:p>
-      <w:pPr>
-        <w:pStyle w:val="affd"/>
-      </w:pPr>
-      <w:r>
-        <w:t>- Использование стандарта JWT для авторизации запросов;</w:t>
-      </w:r>
-    </w:p>
-    <w:p>
-      <w:pPr>
-        <w:pStyle w:val="affd"/>
-      </w:pPr>
-      <w:r>
-        <w:t>- Автоматическая генерация документации через Swagger UI;</w:t>
-      </w:r>
-    </w:p>
-    <w:p>
-      <w:pPr>
-        <w:pStyle w:val="affd"/>
-      </w:pPr>
-      <w:r>
-        <w:t>- Реализация логики определения статуса студента (вовремя, опоздал) на основе сравнения текущего времени с расписанием занятия.</w:t>
-      </w:r>
-    </w:p>
-    <w:p>
-      <w:pPr>
-        <w:pStyle w:val="affd"/>
-      </w:pPr>
-      <w:r>
-        <w:t>Клиентское приложение на WPF служит инструментом для демонстрации возможностей API. Оно отправляет HTTP-запросы на сервер, получает данные в формате JSON и визуализирует их в удобном для пользователя виде.</w:t>
-      </w:r>
-    </w:p>
-    <w:p>
-      <w:pPr>
-        <w:pStyle w:val="affd"/>
-      </w:pPr>
-      <w:r>
-        <w:t>3.2 Разработка описания проекта в GitHub</w:t>
-      </w:r>
-    </w:p>
-    <w:p>
-      <w:pPr>
-        <w:pStyle w:val="affd"/>
-      </w:pPr>
-      <w:r>
-        <w:t>Для управления версиями и организации совместной работы проект размещен в системе GitHub. Структура репозитория организована таким образом, чтобы разделять программный код сервера, базу данных и клиентскую часть.</w:t>
-      </w:r>
-    </w:p>
-    <w:p>
-      <w:pPr>
-        <w:pStyle w:val="affd"/>
-      </w:pPr>
-      <w:r>
-        <w:t>[ВСТАВИТЬ РИСУНОК]</w:t>
-      </w:r>
-    </w:p>
-    <w:p>
-      <w:pPr>
-        <w:pStyle w:val="affd"/>
-      </w:pPr>
-      <w:r>
-        <w:t>Рисунок 6 — Структура проекта в репозитории GitHub</w:t>
-      </w:r>
-    </w:p>
-    <w:p>
-      <w:pPr>
-        <w:pStyle w:val="affd"/>
-      </w:pPr>
-      <w:r>
-        <w:t>В корневой папке проекта находится файл конфигурации для контейнеризации, позволяющий развернуть базу данных и API в одну команду.</w:t>
-      </w:r>
-    </w:p>
-    <w:p>
-      <w:pPr>
-        <w:pStyle w:val="affd"/>
-      </w:pPr>
-      <w:r>
-        <w:t>[ВСТАВИТЬ РИСУНОК]</w:t>
-      </w:r>
-    </w:p>
-    <w:p>
-      <w:pPr>
-        <w:pStyle w:val="affd"/>
-      </w:pPr>
-      <w:r>
-        <w:t>Рисунок 7 — Описание файла README в GitHub</w:t>
-      </w:r>
-    </w:p>
-    <w:p>
-      <w:pPr>
-        <w:pStyle w:val="affd"/>
-      </w:pPr>
-      <w:r>
-        <w:t xml:space="preserve">Файл описания содержит краткую инструкцию по установке зависимостей, запуску системы и документацию по основным эндпоинтам </w:t>
-      </w:r>
-      <w:r>
-        <w:lastRenderedPageBreak/>
-        <w:t>API. Это обеспечивает легкий порог вхождения для других разработчиков или проверяющих лиц.</w:t>
-      </w:r>
-    </w:p>
-    <w:p>
-      <w:pPr>
-        <w:pStyle w:val="affd"/>
-      </w:pPr>
-      <w:r>
-        <w:t>Заключение</w:t>
-      </w:r>
-    </w:p>
-    <w:p>
-      <w:pPr>
-        <w:pStyle w:val="affd"/>
-      </w:pPr>
-      <w:r>
-        <w:t>В результате выполнения курсового проекта была спроектирована и реализована информационная система «CollegeHub», предназначенная для автоматизации учета посещаемости в колледже. В ходе работы были решены следующие задачи:</w:t>
-      </w:r>
-    </w:p>
-    <w:p>
-      <w:pPr>
-        <w:pStyle w:val="affd"/>
-      </w:pPr>
-      <w:r>
-        <w:t>- Проведен детальный анализ предметной области и выделены ключевые роли пользователей;</w:t>
-      </w:r>
-    </w:p>
-    <w:p>
-      <w:pPr>
-        <w:pStyle w:val="affd"/>
-      </w:pPr>
-      <w:r>
-        <w:t>- Спроектирована надежная база данных в MS SQL Server с учетом всех правил целостности данных;</w:t>
-      </w:r>
-    </w:p>
-    <w:p>
-      <w:pPr>
-        <w:pStyle w:val="affd"/>
-      </w:pPr>
-      <w:r>
-        <w:t>- Разработано серверное REST API, обеспечивающее безопасный обмен данными и логику обработки QR-кодов;</w:t>
-      </w:r>
-    </w:p>
-    <w:p>
-      <w:pPr>
-        <w:pStyle w:val="affd"/>
-      </w:pPr>
-      <w:r>
-        <w:t>- Создан клиентский прототип на базе WPF для демонстрации работы системы.</w:t>
-      </w:r>
-    </w:p>
-    <w:p>
-      <w:pPr>
-        <w:pStyle w:val="affd"/>
-      </w:pPr>
-      <w:r>
-        <w:t>Практическая значимость проекта заключается в возможности внедрения данной системы в реальный учебный процесс, что позволит сократить временные затраты на административные задачи и повысить точность сбора статистики посещаемости.</w:t>
-      </w:r>
-    </w:p>
-    <w:p>
-      <w:pPr>
-        <w:pStyle w:val="affd"/>
-      </w:pPr>
-      <w:r>
-        <w:t>Литература</w:t>
-      </w:r>
-    </w:p>
-    <w:p>
-      <w:pPr>
-        <w:pStyle w:val="affd"/>
-      </w:pPr>
-      <w:r>
-        <w:t>1. Конолли, Т. Базы данных. Проектирование, реализация и сопровождение. Теория и практика / Т. Конолли, К. Бегг. — 7-е изд. — Москва : Вильямс, 2021. — 1440 c.;</w:t>
-      </w:r>
-    </w:p>
-    <w:p>
-      <w:pPr>
-        <w:pStyle w:val="affd"/>
-      </w:pPr>
-      <w:r>
-        <w:t>2. Мартин, Р. Чистая архитектура. Искусство разработки программного обеспечения / Р. Мартин. — Санкт-Петербург : Питер, 2022. — 352 c.;</w:t>
-      </w:r>
-    </w:p>
-    <w:p>
-      <w:pPr>
-        <w:pStyle w:val="affd"/>
-      </w:pPr>
-      <w:r>
-        <w:t>3. Шварц, Б. SQL. Сборник рецептов / Б. Шварц. — Санкт-Петербург : Питер, 2023. — 416 c.;</w:t>
-      </w:r>
-    </w:p>
-    <w:p>
-      <w:pPr>
-        <w:pStyle w:val="affd"/>
-        <w:rPr>
+        <w:rPr>
+          <w:color w:val="000000"/>
           <w:lang w:val="en-US"/>
         </w:rPr>
       </w:pPr>
@@ -3741,8 +6862,7 @@
         <w:rPr>
           <w:lang w:val="en-US"/>
         </w:rPr>
-        <w:lastRenderedPageBreak/>
-        <w:t>4. FastAPI Documentation. — URL: https://fastapi.tiangolo.com (</w:t>
+        <w:t>Microsoft SQL Server Documentation. — URL: https://learn.microsoft.com/en-us/sql/sql-server (</w:t>
       </w:r>
       <w:r>
         <w:t>дата</w:t>
@@ -3760,44 +6880,11 @@
         <w:rPr>
           <w:lang w:val="en-US"/>
         </w:rPr>
-        <w:t>: 20.06.2026);</w:t>
-      </w:r>
-    </w:p>
-    <w:p>
-      <w:pPr>
-        <w:pStyle w:val="affd"/>
-        <w:rPr>
-          <w:color w:val="000000"/>
-          <w:lang w:val="en-US"/>
-        </w:rPr>
-      </w:pPr>
-      <w:r>
-        <w:rPr>
-          <w:lang w:val="en-US"/>
-        </w:rPr>
-        <w:t>5. Microsoft SQL Server Documentation. — URL: https://learn.microsoft.com/en-us/sql/sql-server (</w:t>
-      </w:r>
-      <w:r>
-        <w:t>дата</w:t>
-      </w:r>
-      <w:r>
-        <w:rPr>
-          <w:lang w:val="en-US"/>
-        </w:rPr>
-        <w:t xml:space="preserve"> </w:t>
-      </w:r>
-      <w:r>
-        <w:t>обращения</w:t>
-      </w:r>
-      <w:r>
-        <w:rPr>
-          <w:lang w:val="en-US"/>
-        </w:rPr>
         <w:t>: 20.06.2026).</w:t>
       </w:r>
     </w:p>
     <w:sectPr>
-      <w:headerReference w:type="default" r:id="rId14"/>
+      <w:headerReference w:type="default" r:id="rId15"/>
       <w:pgSz w:w="11906" w:h="16838"/>
       <w:pgMar w:top="851" w:right="1021" w:bottom="1701" w:left="1814" w:header="284" w:footer="709" w:gutter="0"/>
       <w:pgNumType w:start="4"/>
@@ -4974,11 +8061,19 @@
                                   <w:sz w:val="20"/>
                                 </w:rPr>
                               </w:pPr>
+                              <w:proofErr w:type="spellStart"/>
                               <w:r>
                                 <w:rPr>
                                   <w:sz w:val="20"/>
                                 </w:rPr>
-                                <w:t>Разраб.</w:t>
+                                <w:t>Разраб</w:t>
+                              </w:r>
+                              <w:proofErr w:type="spellEnd"/>
+                              <w:r>
+                                <w:rPr>
+                                  <w:sz w:val="20"/>
+                                </w:rPr>
+                                <w:t>.</w:t>
                               </w:r>
                             </w:p>
                           </w:txbxContent>
@@ -5568,6 +8663,7 @@
                                 <w:szCs w:val="32"/>
                               </w:rPr>
                             </w:pPr>
+                            <w:proofErr w:type="spellStart"/>
                             <w:r>
                               <w:rPr>
                                 <w:rFonts w:ascii="Times New Roman" w:hAnsi="Times New Roman"/>
@@ -5575,7 +8671,17 @@
                                 <w:sz w:val="32"/>
                                 <w:szCs w:val="32"/>
                               </w:rPr>
-                              <w:t>Курсовой проект</w:t>
+                              <w:t>Курсовой</w:t>
+                            </w:r>
+                            <w:proofErr w:type="spellEnd"/>
+                            <w:r>
+                              <w:rPr>
+                                <w:rFonts w:ascii="Times New Roman" w:hAnsi="Times New Roman"/>
+                                <w:iCs/>
+                                <w:sz w:val="32"/>
+                                <w:szCs w:val="32"/>
+                              </w:rPr>
+                              <w:t xml:space="preserve"> проект</w:t>
                             </w:r>
                           </w:p>
                           <w:p>
@@ -5590,6 +8696,7 @@
                                 <w:szCs w:val="28"/>
                               </w:rPr>
                             </w:pPr>
+                            <w:proofErr w:type="spellStart"/>
                             <w:r>
                               <w:rPr>
                                 <w:rFonts w:ascii="Times New Roman" w:hAnsi="Times New Roman"/>
@@ -5597,7 +8704,17 @@
                                 <w:sz w:val="28"/>
                                 <w:szCs w:val="28"/>
                               </w:rPr>
-                              <w:t>Пояснительная записка</w:t>
+                              <w:t>Пояснительная</w:t>
+                            </w:r>
+                            <w:proofErr w:type="spellEnd"/>
+                            <w:r>
+                              <w:rPr>
+                                <w:rFonts w:ascii="Times New Roman" w:hAnsi="Times New Roman"/>
+                                <w:iCs/>
+                                <w:sz w:val="28"/>
+                                <w:szCs w:val="28"/>
+                              </w:rPr>
+                              <w:t xml:space="preserve"> записка</w:t>
                             </w:r>
                           </w:p>
                         </w:txbxContent>
@@ -6205,11 +9322,19 @@
                             <w:sz w:val="20"/>
                           </w:rPr>
                         </w:pPr>
+                        <w:proofErr w:type="spellStart"/>
                         <w:r>
                           <w:rPr>
                             <w:sz w:val="20"/>
                           </w:rPr>
-                          <w:t>Разраб.</w:t>
+                          <w:t>Разраб</w:t>
+                        </w:r>
+                        <w:proofErr w:type="spellEnd"/>
+                        <w:r>
+                          <w:rPr>
+                            <w:sz w:val="20"/>
+                          </w:rPr>
+                          <w:t>.</w:t>
                         </w:r>
                       </w:p>
                     </w:txbxContent>
@@ -6428,6 +9553,7 @@
                           <w:szCs w:val="32"/>
                         </w:rPr>
                       </w:pPr>
+                      <w:proofErr w:type="spellStart"/>
                       <w:r>
                         <w:rPr>
                           <w:rFonts w:ascii="Times New Roman" w:hAnsi="Times New Roman"/>
@@ -6435,7 +9561,17 @@
                           <w:sz w:val="32"/>
                           <w:szCs w:val="32"/>
                         </w:rPr>
-                        <w:t>Курсовой проект</w:t>
+                        <w:t>Курсовой</w:t>
+                      </w:r>
+                      <w:proofErr w:type="spellEnd"/>
+                      <w:r>
+                        <w:rPr>
+                          <w:rFonts w:ascii="Times New Roman" w:hAnsi="Times New Roman"/>
+                          <w:iCs/>
+                          <w:sz w:val="32"/>
+                          <w:szCs w:val="32"/>
+                        </w:rPr>
+                        <w:t xml:space="preserve"> проект</w:t>
                       </w:r>
                     </w:p>
                     <w:p>
@@ -6450,6 +9586,7 @@
                           <w:szCs w:val="28"/>
                         </w:rPr>
                       </w:pPr>
+                      <w:proofErr w:type="spellStart"/>
                       <w:r>
                         <w:rPr>
                           <w:rFonts w:ascii="Times New Roman" w:hAnsi="Times New Roman"/>
@@ -6457,7 +9594,17 @@
                           <w:sz w:val="28"/>
                           <w:szCs w:val="28"/>
                         </w:rPr>
-                        <w:t>Пояснительная записка</w:t>
+                        <w:t>Пояснительная</w:t>
+                      </w:r>
+                      <w:proofErr w:type="spellEnd"/>
+                      <w:r>
+                        <w:rPr>
+                          <w:rFonts w:ascii="Times New Roman" w:hAnsi="Times New Roman"/>
+                          <w:iCs/>
+                          <w:sz w:val="28"/>
+                          <w:szCs w:val="28"/>
+                        </w:rPr>
+                        <w:t xml:space="preserve"> записка</w:t>
                       </w:r>
                     </w:p>
                   </w:txbxContent>
@@ -7011,6 +10158,7 @@
                                 <w:szCs w:val="18"/>
                               </w:rPr>
                             </w:pPr>
+                            <w:proofErr w:type="spellStart"/>
                             <w:r>
                               <w:rPr>
                                 <w:rFonts w:ascii="Times New Roman" w:hAnsi="Times New Roman"/>
@@ -7018,7 +10166,17 @@
                                 <w:sz w:val="18"/>
                                 <w:szCs w:val="18"/>
                               </w:rPr>
-                              <w:t>Изм.</w:t>
+                              <w:t>Изм</w:t>
+                            </w:r>
+                            <w:proofErr w:type="spellEnd"/>
+                            <w:r>
+                              <w:rPr>
+                                <w:rFonts w:ascii="Times New Roman" w:hAnsi="Times New Roman"/>
+                                <w:i w:val="0"/>
+                                <w:sz w:val="18"/>
+                                <w:szCs w:val="18"/>
+                              </w:rPr>
+                              <w:t>.</w:t>
                             </w:r>
                           </w:p>
                         </w:txbxContent>
@@ -7150,7 +10308,27 @@
                                 <w:sz w:val="18"/>
                                 <w:szCs w:val="18"/>
                               </w:rPr>
-                              <w:t>№ докум.</w:t>
+                              <w:t xml:space="preserve">№ </w:t>
+                            </w:r>
+                            <w:proofErr w:type="spellStart"/>
+                            <w:r>
+                              <w:rPr>
+                                <w:rFonts w:ascii="Times New Roman" w:hAnsi="Times New Roman"/>
+                                <w:i w:val="0"/>
+                                <w:sz w:val="18"/>
+                                <w:szCs w:val="18"/>
+                              </w:rPr>
+                              <w:t>докум</w:t>
+                            </w:r>
+                            <w:proofErr w:type="spellEnd"/>
+                            <w:r>
+                              <w:rPr>
+                                <w:rFonts w:ascii="Times New Roman" w:hAnsi="Times New Roman"/>
+                                <w:i w:val="0"/>
+                                <w:sz w:val="18"/>
+                                <w:szCs w:val="18"/>
+                              </w:rPr>
+                              <w:t>.</w:t>
                             </w:r>
                           </w:p>
                         </w:txbxContent>
@@ -7210,6 +10388,7 @@
                                 <w:lang w:val="ru-RU"/>
                               </w:rPr>
                             </w:pPr>
+                            <w:proofErr w:type="spellStart"/>
                             <w:r>
                               <w:rPr>
                                 <w:rFonts w:ascii="Times New Roman" w:hAnsi="Times New Roman"/>
@@ -7219,6 +10398,7 @@
                               </w:rPr>
                               <w:t>Подп</w:t>
                             </w:r>
+                            <w:proofErr w:type="spellEnd"/>
                             <w:r>
                               <w:rPr>
                                 <w:rFonts w:ascii="Times New Roman" w:hAnsi="Times New Roman"/>
@@ -7628,6 +10808,7 @@
                           <w:szCs w:val="18"/>
                         </w:rPr>
                       </w:pPr>
+                      <w:proofErr w:type="spellStart"/>
                       <w:r>
                         <w:rPr>
                           <w:rFonts w:ascii="Times New Roman" w:hAnsi="Times New Roman"/>
@@ -7635,7 +10816,17 @@
                           <w:sz w:val="18"/>
                           <w:szCs w:val="18"/>
                         </w:rPr>
-                        <w:t>Изм.</w:t>
+                        <w:t>Изм</w:t>
+                      </w:r>
+                      <w:proofErr w:type="spellEnd"/>
+                      <w:r>
+                        <w:rPr>
+                          <w:rFonts w:ascii="Times New Roman" w:hAnsi="Times New Roman"/>
+                          <w:i w:val="0"/>
+                          <w:sz w:val="18"/>
+                          <w:szCs w:val="18"/>
+                        </w:rPr>
+                        <w:t>.</w:t>
                       </w:r>
                     </w:p>
                   </w:txbxContent>
@@ -7689,7 +10880,27 @@
                           <w:sz w:val="18"/>
                           <w:szCs w:val="18"/>
                         </w:rPr>
-                        <w:t>№ докум.</w:t>
+                        <w:t xml:space="preserve">№ </w:t>
+                      </w:r>
+                      <w:proofErr w:type="spellStart"/>
+                      <w:r>
+                        <w:rPr>
+                          <w:rFonts w:ascii="Times New Roman" w:hAnsi="Times New Roman"/>
+                          <w:i w:val="0"/>
+                          <w:sz w:val="18"/>
+                          <w:szCs w:val="18"/>
+                        </w:rPr>
+                        <w:t>докум</w:t>
+                      </w:r>
+                      <w:proofErr w:type="spellEnd"/>
+                      <w:r>
+                        <w:rPr>
+                          <w:rFonts w:ascii="Times New Roman" w:hAnsi="Times New Roman"/>
+                          <w:i w:val="0"/>
+                          <w:sz w:val="18"/>
+                          <w:szCs w:val="18"/>
+                        </w:rPr>
+                        <w:t>.</w:t>
                       </w:r>
                     </w:p>
                   </w:txbxContent>
@@ -7710,6 +10921,7 @@
                           <w:lang w:val="ru-RU"/>
                         </w:rPr>
                       </w:pPr>
+                      <w:proofErr w:type="spellStart"/>
                       <w:r>
                         <w:rPr>
                           <w:rFonts w:ascii="Times New Roman" w:hAnsi="Times New Roman"/>
@@ -7719,6 +10931,7 @@
                         </w:rPr>
                         <w:t>Подп</w:t>
                       </w:r>
+                      <w:proofErr w:type="spellEnd"/>
                       <w:r>
                         <w:rPr>
                           <w:rFonts w:ascii="Times New Roman" w:hAnsi="Times New Roman"/>

</xml_diff>